<commit_message>
fix(m6): harden scoped QA and finalize project handoff
</commit_message>
<xml_diff>
--- a/docs/PharmaColdOps-Group-Report.docx
+++ b/docs/PharmaColdOps-Group-Report.docx
@@ -41,7 +41,15 @@
         <w:rPr>
           <w:sz w:val="22"/>
         </w:rPr>
-        <w:t>The principal result is an implemented, auditable workflow rather than a validated medicine-quality predictor. M3 agreed with historical adjudicated labels in 54 of 57 synthetic scenarios, but missed all three historical quarantine cases. The shipment-risk experiment achieved five-fold PR-AUC 0.7087 and F1 0.6635; monthly candidate-cause classification remained weak. A subsequent event-level simulation study improved held-out macro-F1, while retaining substantial multi-fault and extreme-condition failures. Static routing experiments produced complete feasible solutions in 49 comparisons. Independent M6 evaluation remains incomplete: reviewer A supplied both annotation files, while reviewer B's files and any necessary adjudication have not been collected. We report that gap explicitly.</w:t>
+        <w:t>The principal result is an implemented, auditable workflow rather than a validated medicine-quality predictor. M3 agreed with historical adjudicated labels in 54 of 57 synthetic scenarios, but missed all three historical quarantine cases. The shipment-risk experiment achieved five-fold PR-AUC 0.7087 and F1 0.6635; monthly candidate-cause classification remained weak. A subsequent event-level simulation study improved held-out macro-F1, while retaining substantial multi-fault and extreme-condition failures. Static routing experiments produced complete feasible solutions in 49 comparisons.</w:t>
+      </w:r>
+    </w:p>
+    <w:p>
+      <w:r>
+        <w:rPr>
+          <w:sz w:val="22"/>
+        </w:rPr>
+        <w:t>Independent M6 evaluation remains incomplete: reviewer A supplied both annotation files, while reviewer B's files, the process record and any necessary adjudication have not been collected.</w:t>
       </w:r>
     </w:p>
     <w:p>
@@ -1134,7 +1142,7 @@
         <w:rPr>
           <w:sz w:val="22"/>
         </w:rPr>
-        <w:t>M6 supports disposition reasons, audit chains, product requirements, cause context and disposition statistics. Missing cases, insufficient evidence and graph unavailability are distinct states. The frontend's keyword router may fall back to a conceptual FAQ, which is not counted as a successful live graph query merely because it displays an answer [7].</w:t>
+        <w:t>M6 supports disposition reasons, audit chains, product requirements, cause context and disposition statistics. Missing cases, insufficient evidence and graph unavailability are distinct states. The current frontend labels conceptual help separately, offers explicit structured query selection and refuses unsupported questions. Failed graph queries do not silently become conceptual answers [7].</w:t>
       </w:r>
     </w:p>
     <w:p>
@@ -3185,6 +3193,14 @@
       </w:r>
     </w:p>
     <w:p>
+      <w:r>
+        <w:rPr>
+          <w:sz w:val="22"/>
+        </w:rPr>
+        <w:t>The current interface now separates structured graph queries, concept help, clarification and refusal. It offers five explicit query types, clears stale replies on context changes and exposes recorded reference links. General FAQ text no longer asserts mandatory destruction or that every response has regulatory grounding. These are repairs informed by observed failures and developer regression checks; they do not change or re-score the frozen v1 answers.</w:t>
+      </w:r>
+    </w:p>
+    <w:p>
       <w:pPr>
         <w:pStyle w:val="Heading1"/>
       </w:pPr>
@@ -3197,7 +3213,7 @@
         <w:rPr>
           <w:sz w:val="22"/>
         </w:rPr>
-        <w:t>The 2026-10-17 isolated regression passed 909 tests with zero skips and six existing warnings; a separate API walkthrough passed 36 checks against its own test graph. Frontend production build and eight frontend check scripts passed. Twenty live advisory sample replays and two browser preview branches preserved the original case records. These are software checks, not new model-accuracy observations [9].</w:t>
+        <w:t>The latest 2026-10-17 isolated regression passed 926 tests with zero skips and six existing warnings; a separate API walkthrough passed 36 checks against its own test graph. Frontend production build and nine frontend check scripts passed. Real browser checks covered refusal, concepts, source links, missing and conflicting scope, late replies after case changes, and injected transport failure without changing case records. Twenty live advisory sample replays retained their prior result fingerprint after the QA-only deployment update. These are software checks, not new model-accuracy observations [9].</w:t>
       </w:r>
     </w:p>
     <w:p>
@@ -3205,7 +3221,7 @@
         <w:rPr>
           <w:sz w:val="22"/>
         </w:rPr>
-        <w:t>An initial run passed 892 tests and failed one because the temporary QA fixture had not loaded road relationships. We preserved that result, loaded the complete standard static seed in a new test graph and reran successfully. The historical 2026-10-04 baseline of 888 tests remains a separate record. Local map-tile and no-active-operation 404 responses, plus a large-JavaScript-chunk warning, remain disclosed presentation limitations [9].</w:t>
+        <w:t>Earlier checks passed 909 tests after correcting an incomplete temporary graph seed. A later 925-test run exposed optional reference metadata being filtered from HTTP responses; the response schema and serialization contract were repaired before the successful 926-test run. These earlier results and the historical 888-test baseline remain separate records. Local map-tile and no-active-operation 404 responses, plus a large-JavaScript-chunk warning, remain disclosed presentation limitations [9].</w:t>
       </w:r>
     </w:p>
     <w:p>
@@ -3245,7 +3261,7 @@
         <w:rPr>
           <w:sz w:val="22"/>
         </w:rPr>
-        <w:t xml:space="preserve">Before submission, the team must complete or explicitly disclose the missing M6 independent review, document source verification and seal times, record two five-minute videos with human speech, and submit individual reflections and peer evaluation privately. A frozen source package and a report are not evidence that these human deliverables exist. The </w:t>
+        <w:t xml:space="preserve">Before submission, the team must ensure the M6 review status is disclosed with source verification and seal records, record two five-minute videos with human speech, and submit individual reflections and peer evaluation privately. A frozen source package and a report are not evidence that these human deliverables exist. The </w:t>
       </w:r>
       <w:hyperlink r:id="rId11">
         <w:r>

</xml_diff>

<commit_message>
docs(report): market context and related work, expanded findings, figures, TOC and page numbers
</commit_message>
<xml_diff>
--- a/docs/PharmaColdOps-Group-Report.docx
+++ b/docs/PharmaColdOps-Group-Report.docx
@@ -12,12 +12,845 @@
     </w:p>
     <w:p>
       <w:r>
-        <w:t>IRS Practice Module  |  Project Group 41  |  17 October 2026</w:t>
+        <w:t>IRS Practice Module  |  Project Group 41  |  21 October 2026</w:t>
       </w:r>
     </w:p>
     <w:p>
       <w:r>
         <w:t>Xu Wenzhe, Zhu Jianyu, Wang Lepeng and Shen Ziyi</w:t>
+      </w:r>
+    </w:p>
+    <w:p>
+      <w:r>
+        <w:br w:type="page"/>
+      </w:r>
+    </w:p>
+    <w:p>
+      <w:r>
+        <w:rPr>
+          <w:b/>
+          <w:sz w:val="30"/>
+        </w:rPr>
+        <w:t>Contents</w:t>
+      </w:r>
+    </w:p>
+    <w:p>
+      <w:pPr>
+        <w:tabs>
+          <w:tab w:pos="10080" w:val="right" w:leader="dot"/>
+        </w:tabs>
+      </w:pPr>
+      <w:r>
+        <w:rPr>
+          <w:sz w:val="21"/>
+        </w:rPr>
+        <w:t>Executive summary</w:t>
+      </w:r>
+      <w:r>
+        <w:tab/>
+      </w:r>
+      <w:r>
+        <w:rPr>
+          <w:sz w:val="21"/>
+        </w:rPr>
+        <w:t>3</w:t>
+      </w:r>
+    </w:p>
+    <w:p>
+      <w:pPr>
+        <w:tabs>
+          <w:tab w:pos="10080" w:val="right" w:leader="dot"/>
+        </w:tabs>
+      </w:pPr>
+      <w:r>
+        <w:rPr>
+          <w:sz w:val="21"/>
+        </w:rPr>
+        <w:t>1 Business problem, market context and related work</w:t>
+      </w:r>
+      <w:r>
+        <w:tab/>
+      </w:r>
+      <w:r>
+        <w:rPr>
+          <w:sz w:val="21"/>
+        </w:rPr>
+        <w:t>3</w:t>
+      </w:r>
+    </w:p>
+    <w:p>
+      <w:pPr>
+        <w:tabs>
+          <w:tab w:pos="10080" w:val="right" w:leader="dot"/>
+        </w:tabs>
+        <w:spacing w:after="40"/>
+        <w:ind w:left="360"/>
+      </w:pPr>
+      <w:r>
+        <w:rPr>
+          <w:sz w:val="21"/>
+        </w:rPr>
+        <w:t>1.1 The operational problem</w:t>
+      </w:r>
+      <w:r>
+        <w:tab/>
+      </w:r>
+      <w:r>
+        <w:rPr>
+          <w:sz w:val="21"/>
+        </w:rPr>
+        <w:t>3</w:t>
+      </w:r>
+    </w:p>
+    <w:p>
+      <w:pPr>
+        <w:tabs>
+          <w:tab w:pos="10080" w:val="right" w:leader="dot"/>
+        </w:tabs>
+        <w:spacing w:after="40"/>
+        <w:ind w:left="360"/>
+      </w:pPr>
+      <w:r>
+        <w:rPr>
+          <w:sz w:val="21"/>
+        </w:rPr>
+        <w:t>1.2 Market and regulatory context</w:t>
+      </w:r>
+      <w:r>
+        <w:tab/>
+      </w:r>
+      <w:r>
+        <w:rPr>
+          <w:sz w:val="21"/>
+        </w:rPr>
+        <w:t>3</w:t>
+      </w:r>
+    </w:p>
+    <w:p>
+      <w:pPr>
+        <w:tabs>
+          <w:tab w:pos="10080" w:val="right" w:leader="dot"/>
+        </w:tabs>
+        <w:spacing w:after="40"/>
+        <w:ind w:left="360"/>
+      </w:pPr>
+      <w:r>
+        <w:rPr>
+          <w:sz w:val="21"/>
+        </w:rPr>
+        <w:t>1.3 Related work</w:t>
+      </w:r>
+      <w:r>
+        <w:tab/>
+      </w:r>
+      <w:r>
+        <w:rPr>
+          <w:sz w:val="21"/>
+        </w:rPr>
+        <w:t>4</w:t>
+      </w:r>
+    </w:p>
+    <w:p>
+      <w:pPr>
+        <w:tabs>
+          <w:tab w:pos="10080" w:val="right" w:leader="dot"/>
+        </w:tabs>
+        <w:spacing w:after="40"/>
+        <w:ind w:left="360"/>
+      </w:pPr>
+      <w:r>
+        <w:rPr>
+          <w:sz w:val="21"/>
+        </w:rPr>
+        <w:t>1.4 Positioning and contribution</w:t>
+      </w:r>
+      <w:r>
+        <w:tab/>
+      </w:r>
+      <w:r>
+        <w:rPr>
+          <w:sz w:val="21"/>
+        </w:rPr>
+        <w:t>4</w:t>
+      </w:r>
+    </w:p>
+    <w:p>
+      <w:pPr>
+        <w:tabs>
+          <w:tab w:pos="10080" w:val="right" w:leader="dot"/>
+        </w:tabs>
+      </w:pPr>
+      <w:r>
+        <w:rPr>
+          <w:sz w:val="21"/>
+        </w:rPr>
+        <w:t>2 Domain foundations and method selection</w:t>
+      </w:r>
+      <w:r>
+        <w:tab/>
+      </w:r>
+      <w:r>
+        <w:rPr>
+          <w:sz w:val="21"/>
+        </w:rPr>
+        <w:t>4</w:t>
+      </w:r>
+    </w:p>
+    <w:p>
+      <w:pPr>
+        <w:tabs>
+          <w:tab w:pos="10080" w:val="right" w:leader="dot"/>
+        </w:tabs>
+      </w:pPr>
+      <w:r>
+        <w:rPr>
+          <w:sz w:val="21"/>
+        </w:rPr>
+        <w:t>3 System architecture</w:t>
+      </w:r>
+      <w:r>
+        <w:tab/>
+      </w:r>
+      <w:r>
+        <w:rPr>
+          <w:sz w:val="21"/>
+        </w:rPr>
+        <w:t>5</w:t>
+      </w:r>
+    </w:p>
+    <w:p>
+      <w:pPr>
+        <w:tabs>
+          <w:tab w:pos="10080" w:val="right" w:leader="dot"/>
+        </w:tabs>
+      </w:pPr>
+      <w:r>
+        <w:rPr>
+          <w:sz w:val="21"/>
+        </w:rPr>
+        <w:t>4 Implementation and workflow</w:t>
+      </w:r>
+      <w:r>
+        <w:tab/>
+      </w:r>
+      <w:r>
+        <w:rPr>
+          <w:sz w:val="21"/>
+        </w:rPr>
+        <w:t>6</w:t>
+      </w:r>
+    </w:p>
+    <w:p>
+      <w:pPr>
+        <w:tabs>
+          <w:tab w:pos="10080" w:val="right" w:leader="dot"/>
+        </w:tabs>
+        <w:spacing w:after="40"/>
+        <w:ind w:left="360"/>
+      </w:pPr>
+      <w:r>
+        <w:rPr>
+          <w:sz w:val="21"/>
+        </w:rPr>
+        <w:t>4.1 Temperature assessment and human review</w:t>
+      </w:r>
+      <w:r>
+        <w:tab/>
+      </w:r>
+      <w:r>
+        <w:rPr>
+          <w:sz w:val="21"/>
+        </w:rPr>
+        <w:t>6</w:t>
+      </w:r>
+    </w:p>
+    <w:p>
+      <w:pPr>
+        <w:tabs>
+          <w:tab w:pos="10080" w:val="right" w:leader="dot"/>
+        </w:tabs>
+        <w:spacing w:after="40"/>
+        <w:ind w:left="360"/>
+      </w:pPr>
+      <w:r>
+        <w:rPr>
+          <w:sz w:val="21"/>
+        </w:rPr>
+        <w:t>4.2 Delivery planning and execution</w:t>
+      </w:r>
+      <w:r>
+        <w:tab/>
+      </w:r>
+      <w:r>
+        <w:rPr>
+          <w:sz w:val="21"/>
+        </w:rPr>
+        <w:t>7</w:t>
+      </w:r>
+    </w:p>
+    <w:p>
+      <w:pPr>
+        <w:tabs>
+          <w:tab w:pos="10080" w:val="right" w:leader="dot"/>
+        </w:tabs>
+        <w:spacing w:after="40"/>
+        <w:ind w:left="360"/>
+      </w:pPr>
+      <w:r>
+        <w:rPr>
+          <w:sz w:val="21"/>
+        </w:rPr>
+        <w:t>4.3 Advisory models and graph queries</w:t>
+      </w:r>
+      <w:r>
+        <w:tab/>
+      </w:r>
+      <w:r>
+        <w:rPr>
+          <w:sz w:val="21"/>
+        </w:rPr>
+        <w:t>8</w:t>
+      </w:r>
+    </w:p>
+    <w:p>
+      <w:pPr>
+        <w:tabs>
+          <w:tab w:pos="10080" w:val="right" w:leader="dot"/>
+        </w:tabs>
+      </w:pPr>
+      <w:r>
+        <w:rPr>
+          <w:sz w:val="21"/>
+        </w:rPr>
+        <w:t>5 Data and evaluation design</w:t>
+      </w:r>
+      <w:r>
+        <w:tab/>
+      </w:r>
+      <w:r>
+        <w:rPr>
+          <w:sz w:val="21"/>
+        </w:rPr>
+        <w:t>8</w:t>
+      </w:r>
+    </w:p>
+    <w:p>
+      <w:pPr>
+        <w:tabs>
+          <w:tab w:pos="10080" w:val="right" w:leader="dot"/>
+        </w:tabs>
+      </w:pPr>
+      <w:r>
+        <w:rPr>
+          <w:sz w:val="21"/>
+        </w:rPr>
+        <w:t>6 Experimental results</w:t>
+      </w:r>
+      <w:r>
+        <w:tab/>
+      </w:r>
+      <w:r>
+        <w:rPr>
+          <w:sz w:val="21"/>
+        </w:rPr>
+        <w:t>8</w:t>
+      </w:r>
+    </w:p>
+    <w:p>
+      <w:pPr>
+        <w:tabs>
+          <w:tab w:pos="10080" w:val="right" w:leader="dot"/>
+        </w:tabs>
+        <w:spacing w:after="40"/>
+        <w:ind w:left="360"/>
+      </w:pPr>
+      <w:r>
+        <w:rPr>
+          <w:sz w:val="21"/>
+        </w:rPr>
+        <w:t>6.1 Rule engine</w:t>
+      </w:r>
+      <w:r>
+        <w:tab/>
+      </w:r>
+      <w:r>
+        <w:rPr>
+          <w:sz w:val="21"/>
+        </w:rPr>
+        <w:t>8</w:t>
+      </w:r>
+    </w:p>
+    <w:p>
+      <w:pPr>
+        <w:tabs>
+          <w:tab w:pos="10080" w:val="right" w:leader="dot"/>
+        </w:tabs>
+        <w:spacing w:after="40"/>
+        <w:ind w:left="360"/>
+      </w:pPr>
+      <w:r>
+        <w:rPr>
+          <w:sz w:val="21"/>
+        </w:rPr>
+        <w:t>6.2 Shipment risk and monthly candidate causes</w:t>
+      </w:r>
+      <w:r>
+        <w:tab/>
+      </w:r>
+      <w:r>
+        <w:rPr>
+          <w:sz w:val="21"/>
+        </w:rPr>
+        <w:t>9</w:t>
+      </w:r>
+    </w:p>
+    <w:p>
+      <w:pPr>
+        <w:tabs>
+          <w:tab w:pos="10080" w:val="right" w:leader="dot"/>
+        </w:tabs>
+        <w:spacing w:after="40"/>
+        <w:ind w:left="360"/>
+      </w:pPr>
+      <w:r>
+        <w:rPr>
+          <w:sz w:val="21"/>
+        </w:rPr>
+        <w:t>6.3 Event-level temporal study</w:t>
+      </w:r>
+      <w:r>
+        <w:tab/>
+      </w:r>
+      <w:r>
+        <w:rPr>
+          <w:sz w:val="21"/>
+        </w:rPr>
+        <w:t>10</w:t>
+      </w:r>
+    </w:p>
+    <w:p>
+      <w:pPr>
+        <w:tabs>
+          <w:tab w:pos="10080" w:val="right" w:leader="dot"/>
+        </w:tabs>
+        <w:spacing w:after="40"/>
+        <w:ind w:left="360"/>
+      </w:pPr>
+      <w:r>
+        <w:rPr>
+          <w:sz w:val="21"/>
+        </w:rPr>
+        <w:t>6.4 Static routing</w:t>
+      </w:r>
+      <w:r>
+        <w:tab/>
+      </w:r>
+      <w:r>
+        <w:rPr>
+          <w:sz w:val="21"/>
+        </w:rPr>
+        <w:t>10</w:t>
+      </w:r>
+    </w:p>
+    <w:p>
+      <w:pPr>
+        <w:tabs>
+          <w:tab w:pos="10080" w:val="right" w:leader="dot"/>
+        </w:tabs>
+        <w:spacing w:after="40"/>
+        <w:ind w:left="360"/>
+      </w:pPr>
+      <w:r>
+        <w:rPr>
+          <w:sz w:val="21"/>
+        </w:rPr>
+        <w:t>6.5 Knowledge graph and independent human evaluation</w:t>
+      </w:r>
+      <w:r>
+        <w:tab/>
+      </w:r>
+      <w:r>
+        <w:rPr>
+          <w:sz w:val="21"/>
+        </w:rPr>
+        <w:t>11</w:t>
+      </w:r>
+    </w:p>
+    <w:p>
+      <w:pPr>
+        <w:tabs>
+          <w:tab w:pos="10080" w:val="right" w:leader="dot"/>
+        </w:tabs>
+      </w:pPr>
+      <w:r>
+        <w:rPr>
+          <w:sz w:val="21"/>
+        </w:rPr>
+        <w:t>7 Reliability and reproduction</w:t>
+      </w:r>
+      <w:r>
+        <w:tab/>
+      </w:r>
+      <w:r>
+        <w:rPr>
+          <w:sz w:val="21"/>
+        </w:rPr>
+        <w:t>11</w:t>
+      </w:r>
+    </w:p>
+    <w:p>
+      <w:pPr>
+        <w:tabs>
+          <w:tab w:pos="10080" w:val="right" w:leader="dot"/>
+        </w:tabs>
+      </w:pPr>
+      <w:r>
+        <w:rPr>
+          <w:sz w:val="21"/>
+        </w:rPr>
+        <w:t>8 Findings and discussion</w:t>
+      </w:r>
+      <w:r>
+        <w:tab/>
+      </w:r>
+      <w:r>
+        <w:rPr>
+          <w:sz w:val="21"/>
+        </w:rPr>
+        <w:t>12</w:t>
+      </w:r>
+    </w:p>
+    <w:p>
+      <w:pPr>
+        <w:tabs>
+          <w:tab w:pos="10080" w:val="right" w:leader="dot"/>
+        </w:tabs>
+        <w:spacing w:after="40"/>
+        <w:ind w:left="360"/>
+      </w:pPr>
+      <w:r>
+        <w:rPr>
+          <w:sz w:val="21"/>
+        </w:rPr>
+        <w:t>8.1 What the results support</w:t>
+      </w:r>
+      <w:r>
+        <w:tab/>
+      </w:r>
+      <w:r>
+        <w:rPr>
+          <w:sz w:val="21"/>
+        </w:rPr>
+        <w:t>12</w:t>
+      </w:r>
+    </w:p>
+    <w:p>
+      <w:pPr>
+        <w:tabs>
+          <w:tab w:pos="10080" w:val="right" w:leader="dot"/>
+        </w:tabs>
+        <w:spacing w:after="40"/>
+        <w:ind w:left="360"/>
+      </w:pPr>
+      <w:r>
+        <w:rPr>
+          <w:sz w:val="21"/>
+        </w:rPr>
+        <w:t>8.2 Why the rule engine misses quarantine</w:t>
+      </w:r>
+      <w:r>
+        <w:tab/>
+      </w:r>
+      <w:r>
+        <w:rPr>
+          <w:sz w:val="21"/>
+        </w:rPr>
+        <w:t>12</w:t>
+      </w:r>
+    </w:p>
+    <w:p>
+      <w:pPr>
+        <w:tabs>
+          <w:tab w:pos="10080" w:val="right" w:leader="dot"/>
+        </w:tabs>
+        <w:spacing w:after="40"/>
+        <w:ind w:left="360"/>
+      </w:pPr>
+      <w:r>
+        <w:rPr>
+          <w:sz w:val="21"/>
+        </w:rPr>
+        <w:t>8.3 Why monthly cause classification remains weak</w:t>
+      </w:r>
+      <w:r>
+        <w:tab/>
+      </w:r>
+      <w:r>
+        <w:rPr>
+          <w:sz w:val="21"/>
+        </w:rPr>
+        <w:t>12</w:t>
+      </w:r>
+    </w:p>
+    <w:p>
+      <w:pPr>
+        <w:tabs>
+          <w:tab w:pos="10080" w:val="right" w:leader="dot"/>
+        </w:tabs>
+        <w:spacing w:after="40"/>
+        <w:ind w:left="360"/>
+      </w:pPr>
+      <w:r>
+        <w:rPr>
+          <w:sz w:val="21"/>
+        </w:rPr>
+        <w:t>8.4 What the event-level study adds</w:t>
+      </w:r>
+      <w:r>
+        <w:tab/>
+      </w:r>
+      <w:r>
+        <w:rPr>
+          <w:sz w:val="21"/>
+        </w:rPr>
+        <w:t>13</w:t>
+      </w:r>
+    </w:p>
+    <w:p>
+      <w:pPr>
+        <w:tabs>
+          <w:tab w:pos="10080" w:val="right" w:leader="dot"/>
+        </w:tabs>
+        <w:spacing w:after="40"/>
+        <w:ind w:left="360"/>
+      </w:pPr>
+      <w:r>
+        <w:rPr>
+          <w:sz w:val="21"/>
+        </w:rPr>
+        <w:t>8.5 Deployment implications and limits</w:t>
+      </w:r>
+      <w:r>
+        <w:tab/>
+      </w:r>
+      <w:r>
+        <w:rPr>
+          <w:sz w:val="21"/>
+        </w:rPr>
+        <w:t>13</w:t>
+      </w:r>
+    </w:p>
+    <w:p>
+      <w:pPr>
+        <w:tabs>
+          <w:tab w:pos="10080" w:val="right" w:leader="dot"/>
+        </w:tabs>
+        <w:spacing w:after="40"/>
+        <w:ind w:left="360"/>
+      </w:pPr>
+      <w:r>
+        <w:rPr>
+          <w:sz w:val="21"/>
+        </w:rPr>
+        <w:t>8.6 Remaining work</w:t>
+      </w:r>
+      <w:r>
+        <w:tab/>
+      </w:r>
+      <w:r>
+        <w:rPr>
+          <w:sz w:val="21"/>
+        </w:rPr>
+        <w:t>13</w:t>
+      </w:r>
+    </w:p>
+    <w:p>
+      <w:pPr>
+        <w:tabs>
+          <w:tab w:pos="10080" w:val="right" w:leader="dot"/>
+        </w:tabs>
+        <w:spacing w:after="40"/>
+        <w:ind w:left="360"/>
+      </w:pPr>
+      <w:r>
+        <w:rPr>
+          <w:sz w:val="21"/>
+        </w:rPr>
+        <w:t>8.7 Team contributions and cross-review</w:t>
+      </w:r>
+      <w:r>
+        <w:tab/>
+      </w:r>
+      <w:r>
+        <w:rPr>
+          <w:sz w:val="21"/>
+        </w:rPr>
+        <w:t>13</w:t>
+      </w:r>
+    </w:p>
+    <w:p>
+      <w:pPr>
+        <w:tabs>
+          <w:tab w:pos="10080" w:val="right" w:leader="dot"/>
+        </w:tabs>
+      </w:pPr>
+      <w:r>
+        <w:rPr>
+          <w:sz w:val="21"/>
+        </w:rPr>
+        <w:t>References and project evidence</w:t>
+      </w:r>
+      <w:r>
+        <w:tab/>
+      </w:r>
+      <w:r>
+        <w:rPr>
+          <w:sz w:val="21"/>
+        </w:rPr>
+        <w:t>14</w:t>
+      </w:r>
+    </w:p>
+    <w:p>
+      <w:pPr>
+        <w:tabs>
+          <w:tab w:pos="10080" w:val="right" w:leader="dot"/>
+        </w:tabs>
+      </w:pPr>
+      <w:r>
+        <w:rPr>
+          <w:sz w:val="21"/>
+        </w:rPr>
+        <w:t>Appendix A Mapping to modular course techniques</w:t>
+      </w:r>
+      <w:r>
+        <w:tab/>
+      </w:r>
+      <w:r>
+        <w:rPr>
+          <w:sz w:val="21"/>
+        </w:rPr>
+        <w:t>15</w:t>
+      </w:r>
+    </w:p>
+    <w:p>
+      <w:pPr>
+        <w:tabs>
+          <w:tab w:pos="10080" w:val="right" w:leader="dot"/>
+        </w:tabs>
+      </w:pPr>
+      <w:r>
+        <w:rPr>
+          <w:sz w:val="21"/>
+        </w:rPr>
+        <w:t>Appendix B Installation and user guide</w:t>
+      </w:r>
+      <w:r>
+        <w:tab/>
+      </w:r>
+      <w:r>
+        <w:rPr>
+          <w:sz w:val="21"/>
+        </w:rPr>
+        <w:t>15</w:t>
+      </w:r>
+    </w:p>
+    <w:p>
+      <w:pPr>
+        <w:tabs>
+          <w:tab w:pos="10080" w:val="right" w:leader="dot"/>
+        </w:tabs>
+        <w:spacing w:after="40"/>
+        <w:ind w:left="360"/>
+      </w:pPr>
+      <w:r>
+        <w:rPr>
+          <w:sz w:val="21"/>
+        </w:rPr>
+        <w:t>B1 Fresh demonstration deployment</w:t>
+      </w:r>
+      <w:r>
+        <w:tab/>
+      </w:r>
+      <w:r>
+        <w:rPr>
+          <w:sz w:val="21"/>
+        </w:rPr>
+        <w:t>15</w:t>
+      </w:r>
+    </w:p>
+    <w:p>
+      <w:pPr>
+        <w:tabs>
+          <w:tab w:pos="10080" w:val="right" w:leader="dot"/>
+        </w:tabs>
+        <w:spacing w:after="40"/>
+        <w:ind w:left="360"/>
+      </w:pPr>
+      <w:r>
+        <w:rPr>
+          <w:sz w:val="21"/>
+        </w:rPr>
+        <w:t>B2 Operator walkthrough</w:t>
+      </w:r>
+      <w:r>
+        <w:tab/>
+      </w:r>
+      <w:r>
+        <w:rPr>
+          <w:sz w:val="21"/>
+        </w:rPr>
+        <w:t>15</w:t>
+      </w:r>
+    </w:p>
+    <w:p>
+      <w:pPr>
+        <w:tabs>
+          <w:tab w:pos="10080" w:val="right" w:leader="dot"/>
+        </w:tabs>
+        <w:spacing w:after="40"/>
+        <w:ind w:left="360"/>
+      </w:pPr>
+      <w:r>
+        <w:rPr>
+          <w:sz w:val="21"/>
+        </w:rPr>
+        <w:t>B3 Failure handling and offline mode</w:t>
+      </w:r>
+      <w:r>
+        <w:tab/>
+      </w:r>
+      <w:r>
+        <w:rPr>
+          <w:sz w:val="21"/>
+        </w:rPr>
+        <w:t>16</w:t>
+      </w:r>
+    </w:p>
+    <w:p>
+      <w:pPr>
+        <w:tabs>
+          <w:tab w:pos="10080" w:val="right" w:leader="dot"/>
+        </w:tabs>
+      </w:pPr>
+      <w:r>
+        <w:rPr>
+          <w:sz w:val="21"/>
+        </w:rPr>
+        <w:t>Appendix C Submitted project proposal</w:t>
+      </w:r>
+      <w:r>
+        <w:tab/>
+      </w:r>
+      <w:r>
+        <w:rPr>
+          <w:sz w:val="21"/>
+        </w:rPr>
+        <w:t>16</w:t>
+      </w:r>
+    </w:p>
+    <w:p>
+      <w:r>
+        <w:br w:type="page"/>
       </w:r>
     </w:p>
     <w:p>
@@ -65,7 +898,15 @@
         <w:pStyle w:val="Heading1"/>
       </w:pPr>
       <w:r>
-        <w:t>1 Business problem and intended value</w:t>
+        <w:t>1 Business problem, market context and related work</w:t>
+      </w:r>
+    </w:p>
+    <w:p>
+      <w:pPr>
+        <w:pStyle w:val="Heading2"/>
+      </w:pPr>
+      <w:r>
+        <w:t>1.1 The operational problem</w:t>
       </w:r>
     </w:p>
     <w:p>
@@ -85,11 +926,83 @@
       </w:r>
     </w:p>
     <w:p>
+      <w:pPr>
+        <w:pStyle w:val="Heading2"/>
+      </w:pPr>
+      <w:r>
+        <w:t>1.2 Market and regulatory context</w:t>
+      </w:r>
+    </w:p>
+    <w:p>
       <w:r>
         <w:rPr>
           <w:sz w:val="22"/>
         </w:rPr>
-        <w:t>Commercial monitoring and quality platforms already provide shipment visibility and may support stability-profile workflows. We therefore do not claim that competitors merely raise alarms or that this project invents automated disposition. The differentiating educational contribution is an inspectable integration of rules, ML experiments, constrained routing and graph evidence. The market discussion in the submitted proposal is contextual research, not a current vendor benchmark [1].</w:t>
+        <w:t>Temperature-controlled pharmaceutical distribution is governed by good-distribution requirements: storage and transport conditions must be specified, monitored and documented, and deviations must be investigated before a batch is released or rejected [2]. Monitoring itself is a mature market. Data loggers, probes and cloud dashboards are widely deployed, and commercial platforms already combine shipment visibility with stability and quality workflows [1]. The bottleneck we address is therefore not sensing but the handover between an observation, a defensible disposition and the logistics response that follows it.</w:t>
+      </w:r>
+    </w:p>
+    <w:p>
+      <w:r>
+        <w:rPr>
+          <w:sz w:val="22"/>
+        </w:rPr>
+        <w:t>That handover has three properties a dashboard alone does not provide. The decision must remain inspectable after the fact; the original recommendation must survive a later human override; and any replacement plan must stay tied to the same case identity. Commercial platforms may implement some of these properties, but we make no vendor benchmark and no claim that competitors merely raise alarms. The market discussion in the submitted proposal is contextual research, not a current competitive analysis [1].</w:t>
+      </w:r>
+    </w:p>
+    <w:p>
+      <w:pPr>
+        <w:pStyle w:val="Heading2"/>
+      </w:pPr>
+      <w:r>
+        <w:t>1.3 Related work</w:t>
+      </w:r>
+    </w:p>
+    <w:p>
+      <w:r>
+        <w:rPr>
+          <w:sz w:val="22"/>
+        </w:rPr>
+        <w:t>Cold-chain excursion evidence. Matthias et al. reviewed freezing events in vaccine cold chains and found them widespread and often undetected by routine practice [14]. Kartoglu and Milstien surveyed the tools available for protecting vaccine quality across the chain and argued that the weakest link is frequently the decision and documentation process rather than the sensor [15]. Both findings support an evidence-first disposition workflow, but neither provides an auditable software path from an excursion observation to a logged, reviewable decision.</w:t>
+      </w:r>
+    </w:p>
+    <w:p>
+      <w:r>
+        <w:rPr>
+          <w:sz w:val="22"/>
+        </w:rPr>
+        <w:t>Explainability and decision support. SHAP assigns additive feature attributions with a consistent theoretical basis [16]. We use it offline to inspect model behaviour and explicitly do not treat attributions as causes; the operational decision remains rule-based and human-reviewed. This reflects a broader lesson from decision-support research: explanation is a property of the whole workflow, not of a single model output.</w:t>
+      </w:r>
+    </w:p>
+    <w:p>
+      <w:r>
+        <w:rPr>
+          <w:sz w:val="22"/>
+        </w:rPr>
+        <w:t>Routing. Solomon's VRPTW instances remain the standard comparison set for constrained vehicle routing [6], and OR-Tools provides a time-bounded guided-local-search solver over the same formulation. Our contribution is not a new routing algorithm; it is the integration of routing constraints with case-level replacement demand and recorded execution state.</w:t>
+      </w:r>
+    </w:p>
+    <w:p>
+      <w:r>
+        <w:rPr>
+          <w:sz w:val="22"/>
+        </w:rPr>
+        <w:t>Knowledge graphs. Property-graph case chains follow the general knowledge-graph model of typed entities and relations [17]. We use fixed template queries rather than an LLM so that every answer has a traceable query, an explicit scope and a distinguishable failure state.</w:t>
+      </w:r>
+    </w:p>
+    <w:p>
+      <w:pPr>
+        <w:pStyle w:val="Heading2"/>
+      </w:pPr>
+      <w:r>
+        <w:t>1.4 Positioning and contribution</w:t>
+      </w:r>
+    </w:p>
+    <w:p>
+      <w:r>
+        <w:rPr>
+          <w:sz w:val="22"/>
+        </w:rPr>
+        <w:t>The project contributes an inspectable integration of four IRS technique groups — decision automation, knowledge discovery and data mining, resource optimisation, and cognitive systems — around one case identity. Its distinguishing property is not predictive accuracy but the ability to show, after the fact, which evidence produced which recommendation and which human decision became effective. The prototype is a teaching artefact on simulated data; it is not a validated medicine-quality predictor and does not claim measured operational savings.</w:t>
       </w:r>
     </w:p>
     <w:p>
@@ -148,7 +1061,7 @@
       <w:r>
         <w:drawing>
           <wp:inline xmlns:a="http://schemas.openxmlformats.org/drawingml/2006/main" xmlns:pic="http://schemas.openxmlformats.org/drawingml/2006/picture">
-            <wp:extent cx="6217920" cy="2914650"/>
+            <wp:extent cx="6217920" cy="5715000"/>
             <wp:docPr id="1" name="Picture 1"/>
             <wp:cNvGraphicFramePr>
               <a:graphicFrameLocks noChangeAspect="1"/>
@@ -169,7 +1082,7 @@
                   <pic:spPr>
                     <a:xfrm>
                       <a:off x="0" y="0"/>
-                      <a:ext cx="6217920" cy="2914650"/>
+                      <a:ext cx="6217920" cy="5715000"/>
                     </a:xfrm>
                     <a:prstGeom prst="rect"/>
                   </pic:spPr>
@@ -188,7 +1101,7 @@
         <w:rPr>
           <w:sz w:val="18"/>
         </w:rPr>
-        <w:t>Implemented module flow</w:t>
+        <w:t>Figure 1. Implemented module flow. The advisory path (M4) is drawn separately from the decision path (M3).</w:t>
       </w:r>
     </w:p>
     <w:p>
@@ -1114,6 +2027,57 @@
       </w:r>
     </w:p>
     <w:p>
+      <w:pPr>
+        <w:keepNext/>
+        <w:jc w:val="center"/>
+      </w:pPr>
+      <w:r>
+        <w:drawing>
+          <wp:inline xmlns:a="http://schemas.openxmlformats.org/drawingml/2006/main" xmlns:pic="http://schemas.openxmlformats.org/drawingml/2006/picture">
+            <wp:extent cx="6217920" cy="4480560"/>
+            <wp:docPr id="2" name="Picture 2"/>
+            <wp:cNvGraphicFramePr>
+              <a:graphicFrameLocks noChangeAspect="1"/>
+            </wp:cNvGraphicFramePr>
+            <a:graphic>
+              <a:graphicData uri="http://schemas.openxmlformats.org/drawingml/2006/picture">
+                <pic:pic>
+                  <pic:nvPicPr>
+                    <pic:cNvPr id="0" name="dispatch_disruption_comparison.png"/>
+                    <pic:cNvPicPr/>
+                  </pic:nvPicPr>
+                  <pic:blipFill>
+                    <a:blip r:embed="rId11"/>
+                    <a:stretch>
+                      <a:fillRect/>
+                    </a:stretch>
+                  </pic:blipFill>
+                  <pic:spPr>
+                    <a:xfrm>
+                      <a:off x="0" y="0"/>
+                      <a:ext cx="6217920" cy="4480560"/>
+                    </a:xfrm>
+                    <a:prstGeom prst="rect"/>
+                  </pic:spPr>
+                </pic:pic>
+              </a:graphicData>
+            </a:graphic>
+          </wp:inline>
+        </w:drawing>
+      </w:r>
+    </w:p>
+    <w:p>
+      <w:pPr>
+        <w:jc w:val="center"/>
+      </w:pPr>
+      <w:r>
+        <w:rPr>
+          <w:sz w:val="18"/>
+        </w:rPr>
+        <w:t>Figure 2. Re-route preview for a scrapped case in the live demo, comparing the original plan, the cheapest option (use in-transit surplus) and the most expensive option (return to depot). Interface text is shown in Chinese mode; distances and minutes come from the routing API.</w:t>
+      </w:r>
+    </w:p>
+    <w:p>
       <w:r>
         <w:rPr>
           <w:sz w:val="22"/>
@@ -1158,7 +2122,7 @@
         <w:rPr>
           <w:sz w:val="22"/>
         </w:rPr>
-        <w:t>There is no public dataset in this project with independently validated medicine release, quarantine, retest and scrap decisions. We therefore evaluate each component against an appropriate and explicitly limited reference. The M3 scenario bank contains 57 synthetic scenarios with historical human adjudication. ML sources and licences are documented separately; the shipment-risk dataset is suspected synthetic and the monthly cause dataset is explicitly simulated [2, 4].</w:t>
+        <w:t>There is no public dataset in this project with independently validated medicine release, quarantine, retest and scrap decisions. We therefore evaluate each component against an appropriate and explicitly limited reference. The M3 scenario bank contains 57 synthetic scenarios with historical human adjudication. ML sources and licences are recorded in the data dictionary: the shipment-risk set is a public Kaggle release under CC0 whose documentation and internal checks indicate synthetic generation, and the monthly cause set is explicitly simulated [2, 4].</w:t>
       </w:r>
     </w:p>
     <w:p>
@@ -2272,6 +3236,57 @@
       </w:pPr>
     </w:p>
     <w:p>
+      <w:pPr>
+        <w:keepNext/>
+        <w:jc w:val="center"/>
+      </w:pPr>
+      <w:r>
+        <w:drawing>
+          <wp:inline xmlns:a="http://schemas.openxmlformats.org/drawingml/2006/main" xmlns:pic="http://schemas.openxmlformats.org/drawingml/2006/picture">
+            <wp:extent cx="4389120" cy="4192705"/>
+            <wp:docPr id="3" name="Picture 3"/>
+            <wp:cNvGraphicFramePr>
+              <a:graphicFrameLocks noChangeAspect="1"/>
+            </wp:cNvGraphicFramePr>
+            <a:graphic>
+              <a:graphicData uri="http://schemas.openxmlformats.org/drawingml/2006/picture">
+                <pic:pic>
+                  <pic:nvPicPr>
+                    <pic:cNvPr id="0" name="shap_risk.png"/>
+                    <pic:cNvPicPr/>
+                  </pic:nvPicPr>
+                  <pic:blipFill>
+                    <a:blip r:embed="rId12"/>
+                    <a:stretch>
+                      <a:fillRect/>
+                    </a:stretch>
+                  </pic:blipFill>
+                  <pic:spPr>
+                    <a:xfrm>
+                      <a:off x="0" y="0"/>
+                      <a:ext cx="4389120" cy="4192705"/>
+                    </a:xfrm>
+                    <a:prstGeom prst="rect"/>
+                  </pic:spPr>
+                </pic:pic>
+              </a:graphicData>
+            </a:graphic>
+          </wp:inline>
+        </w:drawing>
+      </w:r>
+    </w:p>
+    <w:p>
+      <w:pPr>
+        <w:jc w:val="center"/>
+      </w:pPr>
+      <w:r>
+        <w:rPr>
+          <w:sz w:val="18"/>
+        </w:rPr>
+        <w:t>Figure 3. Offline Kernel SHAP summary for the selected risk model. Attributions describe model behaviour and are not causal claims.</w:t>
+      </w:r>
+    </w:p>
+    <w:p>
       <w:r>
         <w:rPr>
           <w:sz w:val="22"/>
@@ -3202,6 +4217,57 @@
     </w:p>
     <w:p>
       <w:pPr>
+        <w:keepNext/>
+        <w:jc w:val="center"/>
+      </w:pPr>
+      <w:r>
+        <w:drawing>
+          <wp:inline xmlns:a="http://schemas.openxmlformats.org/drawingml/2006/main" xmlns:pic="http://schemas.openxmlformats.org/drawingml/2006/picture">
+            <wp:extent cx="2926080" cy="2887831"/>
+            <wp:docPr id="4" name="Picture 4"/>
+            <wp:cNvGraphicFramePr>
+              <a:graphicFrameLocks noChangeAspect="1"/>
+            </wp:cNvGraphicFramePr>
+            <a:graphic>
+              <a:graphicData uri="http://schemas.openxmlformats.org/drawingml/2006/picture">
+                <pic:pic>
+                  <pic:nvPicPr>
+                    <pic:cNvPr id="0" name="m6-qa-current-en.png"/>
+                    <pic:cNvPicPr/>
+                  </pic:nvPicPr>
+                  <pic:blipFill>
+                    <a:blip r:embed="rId13"/>
+                    <a:stretch>
+                      <a:fillRect/>
+                    </a:stretch>
+                  </pic:blipFill>
+                  <pic:spPr>
+                    <a:xfrm>
+                      <a:off x="0" y="0"/>
+                      <a:ext cx="2926080" cy="2887831"/>
+                    </a:xfrm>
+                    <a:prstGeom prst="rect"/>
+                  </pic:spPr>
+                </pic:pic>
+              </a:graphicData>
+            </a:graphic>
+          </wp:inline>
+        </w:drawing>
+      </w:r>
+    </w:p>
+    <w:p>
+      <w:pPr>
+        <w:jc w:val="center"/>
+      </w:pPr>
+      <w:r>
+        <w:rPr>
+          <w:sz w:val="18"/>
+        </w:rPr>
+        <w:t>Figure 4. Structured knowledge-graph query panel: explicit query type, scope and a recorded engineering-assumption answer.</w:t>
+      </w:r>
+    </w:p>
+    <w:p>
+      <w:pPr>
         <w:pStyle w:val="Heading1"/>
       </w:pPr>
       <w:r>
@@ -3245,7 +4311,15 @@
         <w:pStyle w:val="Heading1"/>
       </w:pPr>
       <w:r>
-        <w:t>8 Findings and remaining work</w:t>
+        <w:t>8 Findings and discussion</w:t>
+      </w:r>
+    </w:p>
+    <w:p>
+      <w:pPr>
+        <w:pStyle w:val="Heading2"/>
+      </w:pPr>
+      <w:r>
+        <w:t>8.1 What the results support</w:t>
       </w:r>
     </w:p>
     <w:p>
@@ -3253,7 +4327,15 @@
         <w:rPr>
           <w:sz w:val="22"/>
         </w:rPr>
-        <w:t>The implemented rule, review, logistics and graph boundaries make failures inspectable. In particular, a reviewer can trace original evidence without conflating it with a later human outcome, and a failed graph write does not silently erase the authoritative case. The experimental results also limit the product claim: historical policy disagreement, weak monthly causes, multi-fault omissions and incomplete M6 human evidence prevent a claim of autonomous pharmaceutical judgement.</w:t>
+        <w:t>The implemented workflow supports a narrow but real claim: an excursion can travel from observation to a recorded, inspectable decision and a synchronised delivery response without losing the original evidence. The rule engine reproduces 54 of 57 historical adjudications; the risk model reaches a five-fold PR-AUC of 0.7087; the event-level study improves held-out macro-F1 across five roles; and static routing produces complete feasible plans in 49 runs. Each result belongs to its own protocol, and none of them is an end-to-end accuracy figure.</w:t>
+      </w:r>
+    </w:p>
+    <w:p>
+      <w:pPr>
+        <w:pStyle w:val="Heading2"/>
+      </w:pPr>
+      <w:r>
+        <w:t>8.2 Why the rule engine misses quarantine</w:t>
       </w:r>
     </w:p>
     <w:p>
@@ -3261,22 +4343,1030 @@
         <w:rPr>
           <w:sz w:val="22"/>
         </w:rPr>
-        <w:t xml:space="preserve">Before submission, the team must ensure the M6 review status is disclosed with source verification and seal records, record two five-minute videos with human speech, and submit individual reflections and peer evaluation privately. A frozen source package and a report are not evidence that these human deliverables exist. The </w:t>
+        <w:t>All three disagreements are quarantine cases (S034, S035 and S052). The frozen policy emits only release, retest and scrap, while quarantine exists as a human outcome and as a historical label. The gap is therefore a specification difference, not a coding defect: the historical annotators used a category the deployed policy does not produce. We keep the four-class denominator and report zero quarantine recall rather than relabelling the cases to improve the headline number.</w:t>
       </w:r>
-      <w:hyperlink r:id="rId11">
-        <w:r>
-          <w:rPr>
-            <w:color w:val="000000"/>
-            <w:sz w:val="22"/>
-          </w:rPr>
-          <w:t>delivery checklist</w:t>
-        </w:r>
-      </w:hyperlink>
+    </w:p>
+    <w:p>
       <w:r>
         <w:rPr>
           <w:sz w:val="22"/>
         </w:rPr>
-        <w:t xml:space="preserve"> records the remaining inputs.</w:t>
+        <w:t>The same reasoning limits how the agreement rate should be read. Fifty-four of fifty-seven is agreement with one frozen adjudication on a small synthetic scenario bank, not clinical accuracy. The high engine-to-gold kappa of 0.909667 is inflated by the skewed class distribution and by the fact that three of four classes are produced perfectly; it is not comparable to the historical annotator-to-annotator kappa of 0.6434, which describes a different task between different people.</w:t>
+      </w:r>
+    </w:p>
+    <w:p>
+      <w:pPr>
+        <w:pStyle w:val="Heading2"/>
+      </w:pPr>
+      <w:r>
+        <w:t>8.3 Why monthly cause classification remains weak</w:t>
+      </w:r>
+    </w:p>
+    <w:p>
+      <w:r>
+        <w:rPr>
+          <w:sz w:val="22"/>
+        </w:rPr>
+        <w:t>The cause dataset has no event timestamp and only monthly aggregates. Its 447 provided facility groups and 48 months add some structure, but not the physical signal that separates mechanisms such as door opening from staff handling. Macro-F1 near 0.13 and Top-1 near 0.17 are consistent with weak extra feature signal rather than a tuning failure; the learnability audit, including shuffled-label controls and capacity probes, supports that reading. The practical consequence is that candidate causes remain advisory labels for a human reviewer, not diagnoses.</w:t>
+      </w:r>
+    </w:p>
+    <w:p>
+      <w:pPr>
+        <w:pStyle w:val="Heading2"/>
+      </w:pPr>
+      <w:r>
+        <w:t>8.4 What the event-level study adds</w:t>
+      </w:r>
+    </w:p>
+    <w:p>
+      <w:r>
+        <w:rPr>
+          <w:sz w:val="22"/>
+        </w:rPr>
+        <w:t>The simulated event study supplies the temporal and mechanistic detail the monthly data lack. Held-out macro-F1 rises to roughly 0.65–0.77 and within-supported precision is high, but supported coverage stays between 0% and 20.7%, and the extreme-stress cohort supports no candidates at all. Normal-event false alarms remain 47.7–90.8%. Improvement on one simulator is not external validity: all 3,000 test events still required human review, and the extremes show that multi-fault ambiguity survives both better models and more data.</w:t>
+      </w:r>
+    </w:p>
+    <w:p>
+      <w:pPr>
+        <w:pStyle w:val="Heading2"/>
+      </w:pPr>
+      <w:r>
+        <w:t>8.5 Deployment implications and limits</w:t>
+      </w:r>
+    </w:p>
+    <w:p>
+      <w:r>
+        <w:rPr>
+          <w:sz w:val="22"/>
+        </w:rPr>
+        <w:t>The system is a single-worker, loopback-bound demonstration with persistent storage and recovery checks. It has no authentication, no multi-user transaction control and no production service-level agreement. The audit hash detects change; it is not a signature or a compliance certificate. The map shows cached geometry, not live GPS or traffic. These are deliberate boundaries for a teaching prototype, and they are stated in the interface and the user manual rather than left implicit.</w:t>
+      </w:r>
+    </w:p>
+    <w:p>
+      <w:pPr>
+        <w:pStyle w:val="Heading2"/>
+      </w:pPr>
+      <w:r>
+        <w:t>8.6 Remaining work</w:t>
+      </w:r>
+    </w:p>
+    <w:p>
+      <w:r>
+        <w:rPr>
+          <w:sz w:val="22"/>
+        </w:rPr>
+        <w:t>Three items dominate. First, independent dual review of the M6 answers: reviewer B and any required adjudication are still outstanding, so the report presents one reviewer's observations and does not claim dual-rater adequacy. Second, product-specific stability evidence would be needed before any engineering threshold could be described as a release limit. Third, authenticated multi-user operation, real order integration and production monitoring are product work beyond the module. The first is a submission dependency; the other two are research and engineering directions.</w:t>
+      </w:r>
+    </w:p>
+    <w:p>
+      <w:pPr>
+        <w:pStyle w:val="Heading2"/>
+      </w:pPr>
+      <w:r>
+        <w:t>8.7 Team contributions and cross-review</w:t>
+      </w:r>
+    </w:p>
+    <w:p>
+      <w:r>
+        <w:rPr>
+          <w:sz w:val="22"/>
+        </w:rPr>
+        <w:t>Module ownership follows the proposal and is recorded here for traceability. It is not a mark allocation, and the confidential peer-review forms remain the official contribution record.</w:t>
+      </w:r>
+    </w:p>
+    <w:tbl>
+      <w:tblPr>
+        <w:tblW w:type="auto" w:w="0"/>
+        <w:tblLayout w:type="fixed"/>
+        <w:tblLook w:firstColumn="1" w:firstRow="1" w:lastColumn="0" w:lastRow="0" w:noHBand="0" w:noVBand="1" w:val="04A0"/>
+      </w:tblPr>
+      <w:tblGrid>
+        <w:gridCol w:w="3360"/>
+        <w:gridCol w:w="3360"/>
+        <w:gridCol w:w="3360"/>
+      </w:tblGrid>
+      <w:tr>
+        <w:trPr>
+          <w:cantSplit/>
+          <w:tblHeader/>
+        </w:trPr>
+        <w:tc>
+          <w:tcPr>
+            <w:tcW w:type="dxa" w:w="3360"/>
+            <w:vAlign w:val="center"/>
+            <w:tcBorders>
+              <w:top w:val="single" w:sz="4" w:color="D9D9D9"/>
+              <w:left w:val="single" w:sz="4" w:color="D9D9D9"/>
+              <w:bottom w:val="single" w:sz="4" w:color="D9D9D9"/>
+              <w:right w:val="single" w:sz="4" w:color="D9D9D9"/>
+            </w:tcBorders>
+            <w:shd w:fill="24445C"/>
+            <w:tcMar>
+              <w:top w:w="90" w:type="dxa"/>
+              <w:left w:w="90" w:type="dxa"/>
+              <w:bottom w:w="90" w:type="dxa"/>
+              <w:right w:w="90" w:type="dxa"/>
+            </w:tcMar>
+          </w:tcPr>
+          <w:p>
+            <w:pPr>
+              <w:spacing w:after="60"/>
+            </w:pPr>
+            <w:r>
+              <w:rPr>
+                <w:b/>
+                <w:color w:val="FFFFFF"/>
+                <w:sz w:val="20"/>
+              </w:rPr>
+              <w:t>Area</w:t>
+            </w:r>
+          </w:p>
+        </w:tc>
+        <w:tc>
+          <w:tcPr>
+            <w:tcW w:type="dxa" w:w="3360"/>
+            <w:vAlign w:val="center"/>
+            <w:tcBorders>
+              <w:top w:val="single" w:sz="4" w:color="D9D9D9"/>
+              <w:left w:val="single" w:sz="4" w:color="D9D9D9"/>
+              <w:bottom w:val="single" w:sz="4" w:color="D9D9D9"/>
+              <w:right w:val="single" w:sz="4" w:color="D9D9D9"/>
+            </w:tcBorders>
+            <w:shd w:fill="24445C"/>
+            <w:tcMar>
+              <w:top w:w="90" w:type="dxa"/>
+              <w:left w:w="90" w:type="dxa"/>
+              <w:bottom w:w="90" w:type="dxa"/>
+              <w:right w:w="90" w:type="dxa"/>
+            </w:tcMar>
+          </w:tcPr>
+          <w:p>
+            <w:pPr>
+              <w:spacing w:after="60"/>
+            </w:pPr>
+            <w:r>
+              <w:rPr>
+                <w:b/>
+                <w:color w:val="FFFFFF"/>
+                <w:sz w:val="20"/>
+              </w:rPr>
+              <w:t>Primary implementation</w:t>
+            </w:r>
+          </w:p>
+        </w:tc>
+        <w:tc>
+          <w:tcPr>
+            <w:tcW w:type="dxa" w:w="3360"/>
+            <w:vAlign w:val="center"/>
+            <w:tcBorders>
+              <w:top w:val="single" w:sz="4" w:color="D9D9D9"/>
+              <w:left w:val="single" w:sz="4" w:color="D9D9D9"/>
+              <w:bottom w:val="single" w:sz="4" w:color="D9D9D9"/>
+              <w:right w:val="single" w:sz="4" w:color="D9D9D9"/>
+            </w:tcBorders>
+            <w:shd w:fill="24445C"/>
+            <w:tcMar>
+              <w:top w:w="90" w:type="dxa"/>
+              <w:left w:w="90" w:type="dxa"/>
+              <w:bottom w:w="90" w:type="dxa"/>
+              <w:right w:w="90" w:type="dxa"/>
+            </w:tcMar>
+          </w:tcPr>
+          <w:p>
+            <w:pPr>
+              <w:spacing w:after="60"/>
+            </w:pPr>
+            <w:r>
+              <w:rPr>
+                <w:b/>
+                <w:color w:val="FFFFFF"/>
+                <w:sz w:val="20"/>
+              </w:rPr>
+              <w:t>Independent check recorded in this report</w:t>
+            </w:r>
+          </w:p>
+        </w:tc>
+      </w:tr>
+      <w:tr>
+        <w:trPr>
+          <w:cantSplit/>
+        </w:trPr>
+        <w:tc>
+          <w:tcPr>
+            <w:tcW w:type="dxa" w:w="3360"/>
+            <w:vAlign w:val="center"/>
+            <w:tcBorders>
+              <w:top w:val="single" w:sz="4" w:color="D9D9D9"/>
+              <w:left w:val="single" w:sz="4" w:color="D9D9D9"/>
+              <w:bottom w:val="single" w:sz="4" w:color="D9D9D9"/>
+              <w:right w:val="single" w:sz="4" w:color="D9D9D9"/>
+            </w:tcBorders>
+            <w:shd w:fill="F3F6F8"/>
+            <w:tcMar>
+              <w:top w:w="90" w:type="dxa"/>
+              <w:left w:w="90" w:type="dxa"/>
+              <w:bottom w:w="90" w:type="dxa"/>
+              <w:right w:w="90" w:type="dxa"/>
+            </w:tcMar>
+          </w:tcPr>
+          <w:p>
+            <w:pPr>
+              <w:spacing w:after="60"/>
+            </w:pPr>
+            <w:r>
+              <w:rPr>
+                <w:b w:val="0"/>
+                <w:color w:val="000000"/>
+                <w:sz w:val="20"/>
+              </w:rPr>
+              <w:t>M1 simulated data and seeds</w:t>
+            </w:r>
+          </w:p>
+        </w:tc>
+        <w:tc>
+          <w:tcPr>
+            <w:tcW w:type="dxa" w:w="3360"/>
+            <w:vAlign w:val="center"/>
+            <w:tcBorders>
+              <w:top w:val="single" w:sz="4" w:color="D9D9D9"/>
+              <w:left w:val="single" w:sz="4" w:color="D9D9D9"/>
+              <w:bottom w:val="single" w:sz="4" w:color="D9D9D9"/>
+              <w:right w:val="single" w:sz="4" w:color="D9D9D9"/>
+            </w:tcBorders>
+            <w:shd w:fill="F3F6F8"/>
+            <w:tcMar>
+              <w:top w:w="90" w:type="dxa"/>
+              <w:left w:w="90" w:type="dxa"/>
+              <w:bottom w:w="90" w:type="dxa"/>
+              <w:right w:w="90" w:type="dxa"/>
+            </w:tcMar>
+          </w:tcPr>
+          <w:p>
+            <w:pPr>
+              <w:spacing w:after="60"/>
+            </w:pPr>
+            <w:r>
+              <w:rPr>
+                <w:b w:val="0"/>
+                <w:color w:val="000000"/>
+                <w:sz w:val="20"/>
+              </w:rPr>
+              <w:t>B</w:t>
+            </w:r>
+          </w:p>
+        </w:tc>
+        <w:tc>
+          <w:tcPr>
+            <w:tcW w:type="dxa" w:w="3360"/>
+            <w:vAlign w:val="center"/>
+            <w:tcBorders>
+              <w:top w:val="single" w:sz="4" w:color="D9D9D9"/>
+              <w:left w:val="single" w:sz="4" w:color="D9D9D9"/>
+              <w:bottom w:val="single" w:sz="4" w:color="D9D9D9"/>
+              <w:right w:val="single" w:sz="4" w:color="D9D9D9"/>
+            </w:tcBorders>
+            <w:shd w:fill="F3F6F8"/>
+            <w:tcMar>
+              <w:top w:w="90" w:type="dxa"/>
+              <w:left w:w="90" w:type="dxa"/>
+              <w:bottom w:w="90" w:type="dxa"/>
+              <w:right w:w="90" w:type="dxa"/>
+            </w:tcMar>
+          </w:tcPr>
+          <w:p>
+            <w:pPr>
+              <w:spacing w:after="60"/>
+            </w:pPr>
+            <w:r>
+              <w:rPr>
+                <w:b w:val="0"/>
+                <w:color w:val="000000"/>
+                <w:sz w:val="20"/>
+              </w:rPr>
+              <w:t>A: provenance, licence and data-dictionary audit</w:t>
+            </w:r>
+          </w:p>
+        </w:tc>
+      </w:tr>
+      <w:tr>
+        <w:trPr>
+          <w:cantSplit/>
+        </w:trPr>
+        <w:tc>
+          <w:tcPr>
+            <w:tcW w:type="dxa" w:w="3360"/>
+            <w:vAlign w:val="center"/>
+            <w:tcBorders>
+              <w:top w:val="single" w:sz="4" w:color="D9D9D9"/>
+              <w:left w:val="single" w:sz="4" w:color="D9D9D9"/>
+              <w:bottom w:val="single" w:sz="4" w:color="D9D9D9"/>
+              <w:right w:val="single" w:sz="4" w:color="D9D9D9"/>
+            </w:tcBorders>
+            <w:shd w:fill="FFFFFF"/>
+            <w:tcMar>
+              <w:top w:w="90" w:type="dxa"/>
+              <w:left w:w="90" w:type="dxa"/>
+              <w:bottom w:w="90" w:type="dxa"/>
+              <w:right w:w="90" w:type="dxa"/>
+            </w:tcMar>
+          </w:tcPr>
+          <w:p>
+            <w:pPr>
+              <w:spacing w:after="60"/>
+            </w:pPr>
+            <w:r>
+              <w:rPr>
+                <w:b w:val="0"/>
+                <w:color w:val="000000"/>
+                <w:sz w:val="20"/>
+              </w:rPr>
+              <w:t>M2 exposure and MKT</w:t>
+            </w:r>
+          </w:p>
+        </w:tc>
+        <w:tc>
+          <w:tcPr>
+            <w:tcW w:type="dxa" w:w="3360"/>
+            <w:vAlign w:val="center"/>
+            <w:tcBorders>
+              <w:top w:val="single" w:sz="4" w:color="D9D9D9"/>
+              <w:left w:val="single" w:sz="4" w:color="D9D9D9"/>
+              <w:bottom w:val="single" w:sz="4" w:color="D9D9D9"/>
+              <w:right w:val="single" w:sz="4" w:color="D9D9D9"/>
+            </w:tcBorders>
+            <w:shd w:fill="FFFFFF"/>
+            <w:tcMar>
+              <w:top w:w="90" w:type="dxa"/>
+              <w:left w:w="90" w:type="dxa"/>
+              <w:bottom w:w="90" w:type="dxa"/>
+              <w:right w:w="90" w:type="dxa"/>
+            </w:tcMar>
+          </w:tcPr>
+          <w:p>
+            <w:pPr>
+              <w:spacing w:after="60"/>
+            </w:pPr>
+            <w:r>
+              <w:rPr>
+                <w:b w:val="0"/>
+                <w:color w:val="000000"/>
+                <w:sz w:val="20"/>
+              </w:rPr>
+              <w:t>B</w:t>
+            </w:r>
+          </w:p>
+        </w:tc>
+        <w:tc>
+          <w:tcPr>
+            <w:tcW w:type="dxa" w:w="3360"/>
+            <w:vAlign w:val="center"/>
+            <w:tcBorders>
+              <w:top w:val="single" w:sz="4" w:color="D9D9D9"/>
+              <w:left w:val="single" w:sz="4" w:color="D9D9D9"/>
+              <w:bottom w:val="single" w:sz="4" w:color="D9D9D9"/>
+              <w:right w:val="single" w:sz="4" w:color="D9D9D9"/>
+            </w:tcBorders>
+            <w:shd w:fill="FFFFFF"/>
+            <w:tcMar>
+              <w:top w:w="90" w:type="dxa"/>
+              <w:left w:w="90" w:type="dxa"/>
+              <w:bottom w:w="90" w:type="dxa"/>
+              <w:right w:w="90" w:type="dxa"/>
+            </w:tcMar>
+          </w:tcPr>
+          <w:p>
+            <w:pPr>
+              <w:spacing w:after="60"/>
+            </w:pPr>
+            <w:r>
+              <w:rPr>
+                <w:b w:val="0"/>
+                <w:color w:val="000000"/>
+                <w:sz w:val="20"/>
+              </w:rPr>
+              <w:t>A: formula, interval and missing-data contract review</w:t>
+            </w:r>
+          </w:p>
+        </w:tc>
+      </w:tr>
+      <w:tr>
+        <w:trPr>
+          <w:cantSplit/>
+        </w:trPr>
+        <w:tc>
+          <w:tcPr>
+            <w:tcW w:type="dxa" w:w="3360"/>
+            <w:vAlign w:val="center"/>
+            <w:tcBorders>
+              <w:top w:val="single" w:sz="4" w:color="D9D9D9"/>
+              <w:left w:val="single" w:sz="4" w:color="D9D9D9"/>
+              <w:bottom w:val="single" w:sz="4" w:color="D9D9D9"/>
+              <w:right w:val="single" w:sz="4" w:color="D9D9D9"/>
+            </w:tcBorders>
+            <w:shd w:fill="F3F6F8"/>
+            <w:tcMar>
+              <w:top w:w="90" w:type="dxa"/>
+              <w:left w:w="90" w:type="dxa"/>
+              <w:bottom w:w="90" w:type="dxa"/>
+              <w:right w:w="90" w:type="dxa"/>
+            </w:tcMar>
+          </w:tcPr>
+          <w:p>
+            <w:pPr>
+              <w:spacing w:after="60"/>
+            </w:pPr>
+            <w:r>
+              <w:rPr>
+                <w:b w:val="0"/>
+                <w:color w:val="000000"/>
+                <w:sz w:val="20"/>
+              </w:rPr>
+              <w:t>M3 rules and rule evaluation</w:t>
+            </w:r>
+          </w:p>
+        </w:tc>
+        <w:tc>
+          <w:tcPr>
+            <w:tcW w:type="dxa" w:w="3360"/>
+            <w:vAlign w:val="center"/>
+            <w:tcBorders>
+              <w:top w:val="single" w:sz="4" w:color="D9D9D9"/>
+              <w:left w:val="single" w:sz="4" w:color="D9D9D9"/>
+              <w:bottom w:val="single" w:sz="4" w:color="D9D9D9"/>
+              <w:right w:val="single" w:sz="4" w:color="D9D9D9"/>
+            </w:tcBorders>
+            <w:shd w:fill="F3F6F8"/>
+            <w:tcMar>
+              <w:top w:w="90" w:type="dxa"/>
+              <w:left w:w="90" w:type="dxa"/>
+              <w:bottom w:w="90" w:type="dxa"/>
+              <w:right w:w="90" w:type="dxa"/>
+            </w:tcMar>
+          </w:tcPr>
+          <w:p>
+            <w:pPr>
+              <w:spacing w:after="60"/>
+            </w:pPr>
+            <w:r>
+              <w:rPr>
+                <w:b w:val="0"/>
+                <w:color w:val="000000"/>
+                <w:sz w:val="20"/>
+              </w:rPr>
+              <w:t>A</w:t>
+            </w:r>
+          </w:p>
+        </w:tc>
+        <w:tc>
+          <w:tcPr>
+            <w:tcW w:type="dxa" w:w="3360"/>
+            <w:vAlign w:val="center"/>
+            <w:tcBorders>
+              <w:top w:val="single" w:sz="4" w:color="D9D9D9"/>
+              <w:left w:val="single" w:sz="4" w:color="D9D9D9"/>
+              <w:bottom w:val="single" w:sz="4" w:color="D9D9D9"/>
+              <w:right w:val="single" w:sz="4" w:color="D9D9D9"/>
+            </w:tcBorders>
+            <w:shd w:fill="F3F6F8"/>
+            <w:tcMar>
+              <w:top w:w="90" w:type="dxa"/>
+              <w:left w:w="90" w:type="dxa"/>
+              <w:bottom w:w="90" w:type="dxa"/>
+              <w:right w:w="90" w:type="dxa"/>
+            </w:tcMar>
+          </w:tcPr>
+          <w:p>
+            <w:pPr>
+              <w:spacing w:after="60"/>
+            </w:pPr>
+            <w:r>
+              <w:rPr>
+                <w:b w:val="0"/>
+                <w:color w:val="000000"/>
+                <w:sz w:val="20"/>
+              </w:rPr>
+              <w:t>B: threshold and label review</w:t>
+            </w:r>
+          </w:p>
+        </w:tc>
+      </w:tr>
+      <w:tr>
+        <w:trPr>
+          <w:cantSplit/>
+        </w:trPr>
+        <w:tc>
+          <w:tcPr>
+            <w:tcW w:type="dxa" w:w="3360"/>
+            <w:vAlign w:val="center"/>
+            <w:tcBorders>
+              <w:top w:val="single" w:sz="4" w:color="D9D9D9"/>
+              <w:left w:val="single" w:sz="4" w:color="D9D9D9"/>
+              <w:bottom w:val="single" w:sz="4" w:color="D9D9D9"/>
+              <w:right w:val="single" w:sz="4" w:color="D9D9D9"/>
+            </w:tcBorders>
+            <w:shd w:fill="FFFFFF"/>
+            <w:tcMar>
+              <w:top w:w="90" w:type="dxa"/>
+              <w:left w:w="90" w:type="dxa"/>
+              <w:bottom w:w="90" w:type="dxa"/>
+              <w:right w:w="90" w:type="dxa"/>
+            </w:tcMar>
+          </w:tcPr>
+          <w:p>
+            <w:pPr>
+              <w:spacing w:after="60"/>
+            </w:pPr>
+            <w:r>
+              <w:rPr>
+                <w:b w:val="0"/>
+                <w:color w:val="000000"/>
+                <w:sz w:val="20"/>
+              </w:rPr>
+              <w:t>M4 risk and cause experiments</w:t>
+            </w:r>
+          </w:p>
+        </w:tc>
+        <w:tc>
+          <w:tcPr>
+            <w:tcW w:type="dxa" w:w="3360"/>
+            <w:vAlign w:val="center"/>
+            <w:tcBorders>
+              <w:top w:val="single" w:sz="4" w:color="D9D9D9"/>
+              <w:left w:val="single" w:sz="4" w:color="D9D9D9"/>
+              <w:bottom w:val="single" w:sz="4" w:color="D9D9D9"/>
+              <w:right w:val="single" w:sz="4" w:color="D9D9D9"/>
+            </w:tcBorders>
+            <w:shd w:fill="FFFFFF"/>
+            <w:tcMar>
+              <w:top w:w="90" w:type="dxa"/>
+              <w:left w:w="90" w:type="dxa"/>
+              <w:bottom w:w="90" w:type="dxa"/>
+              <w:right w:w="90" w:type="dxa"/>
+            </w:tcMar>
+          </w:tcPr>
+          <w:p>
+            <w:pPr>
+              <w:spacing w:after="60"/>
+            </w:pPr>
+            <w:r>
+              <w:rPr>
+                <w:b w:val="0"/>
+                <w:color w:val="000000"/>
+                <w:sz w:val="20"/>
+              </w:rPr>
+              <w:t>B</w:t>
+            </w:r>
+          </w:p>
+        </w:tc>
+        <w:tc>
+          <w:tcPr>
+            <w:tcW w:type="dxa" w:w="3360"/>
+            <w:vAlign w:val="center"/>
+            <w:tcBorders>
+              <w:top w:val="single" w:sz="4" w:color="D9D9D9"/>
+              <w:left w:val="single" w:sz="4" w:color="D9D9D9"/>
+              <w:bottom w:val="single" w:sz="4" w:color="D9D9D9"/>
+              <w:right w:val="single" w:sz="4" w:color="D9D9D9"/>
+            </w:tcBorders>
+            <w:shd w:fill="FFFFFF"/>
+            <w:tcMar>
+              <w:top w:w="90" w:type="dxa"/>
+              <w:left w:w="90" w:type="dxa"/>
+              <w:bottom w:w="90" w:type="dxa"/>
+              <w:right w:w="90" w:type="dxa"/>
+            </w:tcMar>
+          </w:tcPr>
+          <w:p>
+            <w:pPr>
+              <w:spacing w:after="60"/>
+            </w:pPr>
+            <w:r>
+              <w:rPr>
+                <w:b w:val="0"/>
+                <w:color w:val="000000"/>
+                <w:sz w:val="20"/>
+              </w:rPr>
+              <w:t>A: split, calibration and leakage review</w:t>
+            </w:r>
+          </w:p>
+        </w:tc>
+      </w:tr>
+      <w:tr>
+        <w:trPr>
+          <w:cantSplit/>
+        </w:trPr>
+        <w:tc>
+          <w:tcPr>
+            <w:tcW w:type="dxa" w:w="3360"/>
+            <w:vAlign w:val="center"/>
+            <w:tcBorders>
+              <w:top w:val="single" w:sz="4" w:color="D9D9D9"/>
+              <w:left w:val="single" w:sz="4" w:color="D9D9D9"/>
+              <w:bottom w:val="single" w:sz="4" w:color="D9D9D9"/>
+              <w:right w:val="single" w:sz="4" w:color="D9D9D9"/>
+            </w:tcBorders>
+            <w:shd w:fill="F3F6F8"/>
+            <w:tcMar>
+              <w:top w:w="90" w:type="dxa"/>
+              <w:left w:w="90" w:type="dxa"/>
+              <w:bottom w:w="90" w:type="dxa"/>
+              <w:right w:w="90" w:type="dxa"/>
+            </w:tcMar>
+          </w:tcPr>
+          <w:p>
+            <w:pPr>
+              <w:spacing w:after="60"/>
+            </w:pPr>
+            <w:r>
+              <w:rPr>
+                <w:b w:val="0"/>
+                <w:color w:val="000000"/>
+                <w:sz w:val="20"/>
+              </w:rPr>
+              <w:t>M5 routing and dispatch</w:t>
+            </w:r>
+          </w:p>
+        </w:tc>
+        <w:tc>
+          <w:tcPr>
+            <w:tcW w:type="dxa" w:w="3360"/>
+            <w:vAlign w:val="center"/>
+            <w:tcBorders>
+              <w:top w:val="single" w:sz="4" w:color="D9D9D9"/>
+              <w:left w:val="single" w:sz="4" w:color="D9D9D9"/>
+              <w:bottom w:val="single" w:sz="4" w:color="D9D9D9"/>
+              <w:right w:val="single" w:sz="4" w:color="D9D9D9"/>
+            </w:tcBorders>
+            <w:shd w:fill="F3F6F8"/>
+            <w:tcMar>
+              <w:top w:w="90" w:type="dxa"/>
+              <w:left w:w="90" w:type="dxa"/>
+              <w:bottom w:w="90" w:type="dxa"/>
+              <w:right w:w="90" w:type="dxa"/>
+            </w:tcMar>
+          </w:tcPr>
+          <w:p>
+            <w:pPr>
+              <w:spacing w:after="60"/>
+            </w:pPr>
+            <w:r>
+              <w:rPr>
+                <w:b w:val="0"/>
+                <w:color w:val="000000"/>
+                <w:sz w:val="20"/>
+              </w:rPr>
+              <w:t>C</w:t>
+            </w:r>
+          </w:p>
+        </w:tc>
+        <w:tc>
+          <w:tcPr>
+            <w:tcW w:type="dxa" w:w="3360"/>
+            <w:vAlign w:val="center"/>
+            <w:tcBorders>
+              <w:top w:val="single" w:sz="4" w:color="D9D9D9"/>
+              <w:left w:val="single" w:sz="4" w:color="D9D9D9"/>
+              <w:bottom w:val="single" w:sz="4" w:color="D9D9D9"/>
+              <w:right w:val="single" w:sz="4" w:color="D9D9D9"/>
+            </w:tcBorders>
+            <w:shd w:fill="F3F6F8"/>
+            <w:tcMar>
+              <w:top w:w="90" w:type="dxa"/>
+              <w:left w:w="90" w:type="dxa"/>
+              <w:bottom w:w="90" w:type="dxa"/>
+              <w:right w:w="90" w:type="dxa"/>
+            </w:tcMar>
+          </w:tcPr>
+          <w:p>
+            <w:pPr>
+              <w:spacing w:after="60"/>
+            </w:pPr>
+            <w:r>
+              <w:rPr>
+                <w:b w:val="0"/>
+                <w:color w:val="000000"/>
+                <w:sz w:val="20"/>
+              </w:rPr>
+              <w:t>D: API and UI contract review</w:t>
+            </w:r>
+          </w:p>
+        </w:tc>
+      </w:tr>
+      <w:tr>
+        <w:trPr>
+          <w:cantSplit/>
+        </w:trPr>
+        <w:tc>
+          <w:tcPr>
+            <w:tcW w:type="dxa" w:w="3360"/>
+            <w:vAlign w:val="center"/>
+            <w:tcBorders>
+              <w:top w:val="single" w:sz="4" w:color="D9D9D9"/>
+              <w:left w:val="single" w:sz="4" w:color="D9D9D9"/>
+              <w:bottom w:val="single" w:sz="4" w:color="D9D9D9"/>
+              <w:right w:val="single" w:sz="4" w:color="D9D9D9"/>
+            </w:tcBorders>
+            <w:shd w:fill="FFFFFF"/>
+            <w:tcMar>
+              <w:top w:w="90" w:type="dxa"/>
+              <w:left w:w="90" w:type="dxa"/>
+              <w:bottom w:w="90" w:type="dxa"/>
+              <w:right w:w="90" w:type="dxa"/>
+            </w:tcMar>
+          </w:tcPr>
+          <w:p>
+            <w:pPr>
+              <w:spacing w:after="60"/>
+            </w:pPr>
+            <w:r>
+              <w:rPr>
+                <w:b w:val="0"/>
+                <w:color w:val="000000"/>
+                <w:sz w:val="20"/>
+              </w:rPr>
+              <w:t>M6 graph and QA</w:t>
+            </w:r>
+          </w:p>
+        </w:tc>
+        <w:tc>
+          <w:tcPr>
+            <w:tcW w:type="dxa" w:w="3360"/>
+            <w:vAlign w:val="center"/>
+            <w:tcBorders>
+              <w:top w:val="single" w:sz="4" w:color="D9D9D9"/>
+              <w:left w:val="single" w:sz="4" w:color="D9D9D9"/>
+              <w:bottom w:val="single" w:sz="4" w:color="D9D9D9"/>
+              <w:right w:val="single" w:sz="4" w:color="D9D9D9"/>
+            </w:tcBorders>
+            <w:shd w:fill="FFFFFF"/>
+            <w:tcMar>
+              <w:top w:w="90" w:type="dxa"/>
+              <w:left w:w="90" w:type="dxa"/>
+              <w:bottom w:w="90" w:type="dxa"/>
+              <w:right w:w="90" w:type="dxa"/>
+            </w:tcMar>
+          </w:tcPr>
+          <w:p>
+            <w:pPr>
+              <w:spacing w:after="60"/>
+            </w:pPr>
+            <w:r>
+              <w:rPr>
+                <w:b w:val="0"/>
+                <w:color w:val="000000"/>
+                <w:sz w:val="20"/>
+              </w:rPr>
+              <w:t>D</w:t>
+            </w:r>
+          </w:p>
+        </w:tc>
+        <w:tc>
+          <w:tcPr>
+            <w:tcW w:type="dxa" w:w="3360"/>
+            <w:vAlign w:val="center"/>
+            <w:tcBorders>
+              <w:top w:val="single" w:sz="4" w:color="D9D9D9"/>
+              <w:left w:val="single" w:sz="4" w:color="D9D9D9"/>
+              <w:bottom w:val="single" w:sz="4" w:color="D9D9D9"/>
+              <w:right w:val="single" w:sz="4" w:color="D9D9D9"/>
+            </w:tcBorders>
+            <w:shd w:fill="FFFFFF"/>
+            <w:tcMar>
+              <w:top w:w="90" w:type="dxa"/>
+              <w:left w:w="90" w:type="dxa"/>
+              <w:bottom w:w="90" w:type="dxa"/>
+              <w:right w:w="90" w:type="dxa"/>
+            </w:tcMar>
+          </w:tcPr>
+          <w:p>
+            <w:pPr>
+              <w:spacing w:after="60"/>
+            </w:pPr>
+            <w:r>
+              <w:rPr>
+                <w:b w:val="0"/>
+                <w:color w:val="000000"/>
+                <w:sz w:val="20"/>
+              </w:rPr>
+              <w:t>A: evidence-state and refusal review</w:t>
+            </w:r>
+          </w:p>
+        </w:tc>
+      </w:tr>
+      <w:tr>
+        <w:trPr>
+          <w:cantSplit/>
+        </w:trPr>
+        <w:tc>
+          <w:tcPr>
+            <w:tcW w:type="dxa" w:w="3360"/>
+            <w:vAlign w:val="center"/>
+            <w:tcBorders>
+              <w:top w:val="single" w:sz="4" w:color="D9D9D9"/>
+              <w:left w:val="single" w:sz="4" w:color="D9D9D9"/>
+              <w:bottom w:val="single" w:sz="4" w:color="D9D9D9"/>
+              <w:right w:val="single" w:sz="4" w:color="D9D9D9"/>
+            </w:tcBorders>
+            <w:shd w:fill="F3F6F8"/>
+            <w:tcMar>
+              <w:top w:w="90" w:type="dxa"/>
+              <w:left w:w="90" w:type="dxa"/>
+              <w:bottom w:w="90" w:type="dxa"/>
+              <w:right w:w="90" w:type="dxa"/>
+            </w:tcMar>
+          </w:tcPr>
+          <w:p>
+            <w:pPr>
+              <w:spacing w:after="60"/>
+            </w:pPr>
+            <w:r>
+              <w:rPr>
+                <w:b w:val="0"/>
+                <w:color w:val="000000"/>
+                <w:sz w:val="20"/>
+              </w:rPr>
+              <w:t>M7 API, frontend and deployment</w:t>
+            </w:r>
+          </w:p>
+        </w:tc>
+        <w:tc>
+          <w:tcPr>
+            <w:tcW w:type="dxa" w:w="3360"/>
+            <w:vAlign w:val="center"/>
+            <w:tcBorders>
+              <w:top w:val="single" w:sz="4" w:color="D9D9D9"/>
+              <w:left w:val="single" w:sz="4" w:color="D9D9D9"/>
+              <w:bottom w:val="single" w:sz="4" w:color="D9D9D9"/>
+              <w:right w:val="single" w:sz="4" w:color="D9D9D9"/>
+            </w:tcBorders>
+            <w:shd w:fill="F3F6F8"/>
+            <w:tcMar>
+              <w:top w:w="90" w:type="dxa"/>
+              <w:left w:w="90" w:type="dxa"/>
+              <w:bottom w:w="90" w:type="dxa"/>
+              <w:right w:w="90" w:type="dxa"/>
+            </w:tcMar>
+          </w:tcPr>
+          <w:p>
+            <w:pPr>
+              <w:spacing w:after="60"/>
+            </w:pPr>
+            <w:r>
+              <w:rPr>
+                <w:b w:val="0"/>
+                <w:color w:val="000000"/>
+                <w:sz w:val="20"/>
+              </w:rPr>
+              <w:t>D</w:t>
+            </w:r>
+          </w:p>
+        </w:tc>
+        <w:tc>
+          <w:tcPr>
+            <w:tcW w:type="dxa" w:w="3360"/>
+            <w:vAlign w:val="center"/>
+            <w:tcBorders>
+              <w:top w:val="single" w:sz="4" w:color="D9D9D9"/>
+              <w:left w:val="single" w:sz="4" w:color="D9D9D9"/>
+              <w:bottom w:val="single" w:sz="4" w:color="D9D9D9"/>
+              <w:right w:val="single" w:sz="4" w:color="D9D9D9"/>
+            </w:tcBorders>
+            <w:shd w:fill="F3F6F8"/>
+            <w:tcMar>
+              <w:top w:w="90" w:type="dxa"/>
+              <w:left w:w="90" w:type="dxa"/>
+              <w:bottom w:w="90" w:type="dxa"/>
+              <w:right w:w="90" w:type="dxa"/>
+            </w:tcMar>
+          </w:tcPr>
+          <w:p>
+            <w:pPr>
+              <w:spacing w:after="60"/>
+            </w:pPr>
+            <w:r>
+              <w:rPr>
+                <w:b w:val="0"/>
+                <w:color w:val="000000"/>
+                <w:sz w:val="20"/>
+              </w:rPr>
+              <w:t>C: dispatch contract review</w:t>
+            </w:r>
+          </w:p>
+        </w:tc>
+      </w:tr>
+      <w:tr>
+        <w:trPr>
+          <w:cantSplit/>
+        </w:trPr>
+        <w:tc>
+          <w:tcPr>
+            <w:tcW w:type="dxa" w:w="3360"/>
+            <w:vAlign w:val="center"/>
+            <w:tcBorders>
+              <w:top w:val="single" w:sz="4" w:color="D9D9D9"/>
+              <w:left w:val="single" w:sz="4" w:color="D9D9D9"/>
+              <w:bottom w:val="single" w:sz="4" w:color="D9D9D9"/>
+              <w:right w:val="single" w:sz="4" w:color="D9D9D9"/>
+            </w:tcBorders>
+            <w:shd w:fill="FFFFFF"/>
+            <w:tcMar>
+              <w:top w:w="90" w:type="dxa"/>
+              <w:left w:w="90" w:type="dxa"/>
+              <w:bottom w:w="90" w:type="dxa"/>
+              <w:right w:w="90" w:type="dxa"/>
+            </w:tcMar>
+          </w:tcPr>
+          <w:p>
+            <w:pPr>
+              <w:spacing w:after="60"/>
+            </w:pPr>
+            <w:r>
+              <w:rPr>
+                <w:b w:val="0"/>
+                <w:color w:val="000000"/>
+                <w:sz w:val="20"/>
+              </w:rPr>
+              <w:t>Report, videos and submission pack</w:t>
+            </w:r>
+          </w:p>
+        </w:tc>
+        <w:tc>
+          <w:tcPr>
+            <w:tcW w:type="dxa" w:w="3360"/>
+            <w:vAlign w:val="center"/>
+            <w:tcBorders>
+              <w:top w:val="single" w:sz="4" w:color="D9D9D9"/>
+              <w:left w:val="single" w:sz="4" w:color="D9D9D9"/>
+              <w:bottom w:val="single" w:sz="4" w:color="D9D9D9"/>
+              <w:right w:val="single" w:sz="4" w:color="D9D9D9"/>
+            </w:tcBorders>
+            <w:shd w:fill="FFFFFF"/>
+            <w:tcMar>
+              <w:top w:w="90" w:type="dxa"/>
+              <w:left w:w="90" w:type="dxa"/>
+              <w:bottom w:w="90" w:type="dxa"/>
+              <w:right w:w="90" w:type="dxa"/>
+            </w:tcMar>
+          </w:tcPr>
+          <w:p>
+            <w:pPr>
+              <w:spacing w:after="60"/>
+            </w:pPr>
+            <w:r>
+              <w:rPr>
+                <w:b w:val="0"/>
+                <w:color w:val="000000"/>
+                <w:sz w:val="20"/>
+              </w:rPr>
+              <w:t>A report, D videos, C packaging, B data statements</w:t>
+            </w:r>
+          </w:p>
+        </w:tc>
+        <w:tc>
+          <w:tcPr>
+            <w:tcW w:type="dxa" w:w="3360"/>
+            <w:vAlign w:val="center"/>
+            <w:tcBorders>
+              <w:top w:val="single" w:sz="4" w:color="D9D9D9"/>
+              <w:left w:val="single" w:sz="4" w:color="D9D9D9"/>
+              <w:bottom w:val="single" w:sz="4" w:color="D9D9D9"/>
+              <w:right w:val="single" w:sz="4" w:color="D9D9D9"/>
+            </w:tcBorders>
+            <w:shd w:fill="FFFFFF"/>
+            <w:tcMar>
+              <w:top w:w="90" w:type="dxa"/>
+              <w:left w:w="90" w:type="dxa"/>
+              <w:bottom w:w="90" w:type="dxa"/>
+              <w:right w:w="90" w:type="dxa"/>
+            </w:tcMar>
+          </w:tcPr>
+          <w:p>
+            <w:pPr>
+              <w:spacing w:after="60"/>
+            </w:pPr>
+            <w:r>
+              <w:rPr>
+                <w:b w:val="0"/>
+                <w:color w:val="000000"/>
+                <w:sz w:val="20"/>
+              </w:rPr>
+              <w:t>Whole-team read-through</w:t>
+            </w:r>
+          </w:p>
+        </w:tc>
+      </w:tr>
+    </w:tbl>
+    <w:p>
+      <w:pPr>
+        <w:spacing w:after="0"/>
+      </w:pPr>
+    </w:p>
+    <w:p>
+      <w:r>
+        <w:rPr>
+          <w:sz w:val="22"/>
+        </w:rPr>
+        <w:t>The cross-checks are visible in the repository history and in the module documents cited above. They show review relationships rather than a division of credit.</w:t>
       </w:r>
     </w:p>
     <w:p>
@@ -3302,7 +5392,7 @@
         </w:rPr>
         <w:t xml:space="preserve">2. </w:t>
       </w:r>
-      <w:hyperlink r:id="rId12">
+      <w:hyperlink r:id="rId14">
         <w:r>
           <w:rPr>
             <w:color w:val="000000"/>
@@ -3317,7 +5407,7 @@
         </w:rPr>
         <w:t xml:space="preserve"> and </w:t>
       </w:r>
-      <w:hyperlink r:id="rId13">
+      <w:hyperlink r:id="rId15">
         <w:r>
           <w:rPr>
             <w:color w:val="000000"/>
@@ -3332,7 +5422,7 @@
         </w:rPr>
         <w:t xml:space="preserve">. Public anchors: </w:t>
       </w:r>
-      <w:hyperlink r:id="rId14">
+      <w:hyperlink r:id="rId16">
         <w:r>
           <w:rPr>
             <w:color w:val="000000"/>
@@ -3347,7 +5437,7 @@
         </w:rPr>
         <w:t xml:space="preserve"> and </w:t>
       </w:r>
-      <w:hyperlink r:id="rId15">
+      <w:hyperlink r:id="rId17">
         <w:r>
           <w:rPr>
             <w:color w:val="000000"/>
@@ -3370,7 +5460,7 @@
         </w:rPr>
         <w:t xml:space="preserve">3. </w:t>
       </w:r>
-      <w:hyperlink r:id="rId16">
+      <w:hyperlink r:id="rId18">
         <w:r>
           <w:rPr>
             <w:color w:val="000000"/>
@@ -3385,7 +5475,7 @@
         </w:rPr>
         <w:t xml:space="preserve"> and </w:t>
       </w:r>
-      <w:hyperlink r:id="rId17">
+      <w:hyperlink r:id="rId19">
         <w:r>
           <w:rPr>
             <w:color w:val="000000"/>
@@ -3408,7 +5498,7 @@
         </w:rPr>
         <w:t xml:space="preserve">4. </w:t>
       </w:r>
-      <w:hyperlink r:id="rId18">
+      <w:hyperlink r:id="rId20">
         <w:r>
           <w:rPr>
             <w:color w:val="000000"/>
@@ -3423,7 +5513,7 @@
         </w:rPr>
         <w:t xml:space="preserve"> and </w:t>
       </w:r>
-      <w:hyperlink r:id="rId19">
+      <w:hyperlink r:id="rId21">
         <w:r>
           <w:rPr>
             <w:color w:val="000000"/>
@@ -3446,7 +5536,7 @@
         </w:rPr>
         <w:t xml:space="preserve">5. </w:t>
       </w:r>
-      <w:hyperlink r:id="rId20">
+      <w:hyperlink r:id="rId22">
         <w:r>
           <w:rPr>
             <w:color w:val="000000"/>
@@ -3461,7 +5551,7 @@
         </w:rPr>
         <w:t xml:space="preserve"> and </w:t>
       </w:r>
-      <w:hyperlink r:id="rId21">
+      <w:hyperlink r:id="rId23">
         <w:r>
           <w:rPr>
             <w:color w:val="000000"/>
@@ -3484,7 +5574,7 @@
         </w:rPr>
         <w:t xml:space="preserve">6. </w:t>
       </w:r>
-      <w:hyperlink r:id="rId22">
+      <w:hyperlink r:id="rId24">
         <w:r>
           <w:rPr>
             <w:color w:val="000000"/>
@@ -3499,7 +5589,7 @@
         </w:rPr>
         <w:t xml:space="preserve">. Solomon, M. M. (1987), Algorithms for the Vehicle Routing and Scheduling Problems with Time Window Constraints, </w:t>
       </w:r>
-      <w:hyperlink r:id="rId23">
+      <w:hyperlink r:id="rId25">
         <w:r>
           <w:rPr>
             <w:color w:val="000000"/>
@@ -3514,7 +5604,7 @@
         </w:rPr>
         <w:t xml:space="preserve">; frozen comparison documented against </w:t>
       </w:r>
-      <w:hyperlink r:id="rId24">
+      <w:hyperlink r:id="rId26">
         <w:r>
           <w:rPr>
             <w:color w:val="000000"/>
@@ -3537,7 +5627,7 @@
         </w:rPr>
         <w:t xml:space="preserve">7. </w:t>
       </w:r>
-      <w:hyperlink r:id="rId25">
+      <w:hyperlink r:id="rId27">
         <w:r>
           <w:rPr>
             <w:color w:val="000000"/>
@@ -3552,7 +5642,7 @@
         </w:rPr>
         <w:t xml:space="preserve">, </w:t>
       </w:r>
-      <w:hyperlink r:id="rId26">
+      <w:hyperlink r:id="rId28">
         <w:r>
           <w:rPr>
             <w:color w:val="000000"/>
@@ -3567,7 +5657,7 @@
         </w:rPr>
         <w:t xml:space="preserve"> and </w:t>
       </w:r>
-      <w:hyperlink r:id="rId27">
+      <w:hyperlink r:id="rId29">
         <w:r>
           <w:rPr>
             <w:color w:val="000000"/>
@@ -3590,7 +5680,7 @@
         </w:rPr>
         <w:t xml:space="preserve">8. </w:t>
       </w:r>
-      <w:hyperlink r:id="rId28">
+      <w:hyperlink r:id="rId30">
         <w:r>
           <w:rPr>
             <w:color w:val="000000"/>
@@ -3605,7 +5695,7 @@
         </w:rPr>
         <w:t xml:space="preserve"> and </w:t>
       </w:r>
-      <w:hyperlink r:id="rId29">
+      <w:hyperlink r:id="rId31">
         <w:r>
           <w:rPr>
             <w:color w:val="000000"/>
@@ -3628,7 +5718,7 @@
         </w:rPr>
         <w:t xml:space="preserve">9. </w:t>
       </w:r>
-      <w:hyperlink r:id="rId30">
+      <w:hyperlink r:id="rId32">
         <w:r>
           <w:rPr>
             <w:color w:val="000000"/>
@@ -3643,7 +5733,7 @@
         </w:rPr>
         <w:t xml:space="preserve">, </w:t>
       </w:r>
-      <w:hyperlink r:id="rId31">
+      <w:hyperlink r:id="rId33">
         <w:r>
           <w:rPr>
             <w:color w:val="000000"/>
@@ -3658,7 +5748,7 @@
         </w:rPr>
         <w:t xml:space="preserve"> and </w:t>
       </w:r>
-      <w:hyperlink r:id="rId32">
+      <w:hyperlink r:id="rId34">
         <w:r>
           <w:rPr>
             <w:color w:val="000000"/>
@@ -3681,7 +5771,7 @@
         </w:rPr>
         <w:t xml:space="preserve">10. </w:t>
       </w:r>
-      <w:hyperlink r:id="rId33">
+      <w:hyperlink r:id="rId35">
         <w:r>
           <w:rPr>
             <w:color w:val="000000"/>
@@ -3704,7 +5794,7 @@
         </w:rPr>
         <w:t xml:space="preserve">11. </w:t>
       </w:r>
-      <w:hyperlink r:id="rId29">
+      <w:hyperlink r:id="rId31">
         <w:r>
           <w:rPr>
             <w:color w:val="000000"/>
@@ -3727,7 +5817,7 @@
         </w:rPr>
         <w:t xml:space="preserve">12. </w:t>
       </w:r>
-      <w:hyperlink r:id="rId34">
+      <w:hyperlink r:id="rId36">
         <w:r>
           <w:rPr>
             <w:color w:val="000000"/>
@@ -3742,7 +5832,7 @@
         </w:rPr>
         <w:t xml:space="preserve"> and </w:t>
       </w:r>
-      <w:hyperlink r:id="rId35">
+      <w:hyperlink r:id="rId37">
         <w:r>
           <w:rPr>
             <w:color w:val="000000"/>
@@ -3765,7 +5855,7 @@
         </w:rPr>
         <w:t xml:space="preserve">13. </w:t>
       </w:r>
-      <w:hyperlink r:id="rId36">
+      <w:hyperlink r:id="rId38">
         <w:r>
           <w:rPr>
             <w:color w:val="000000"/>
@@ -3780,7 +5870,7 @@
         </w:rPr>
         <w:t xml:space="preserve"> and </w:t>
       </w:r>
-      <w:hyperlink r:id="rId37">
+      <w:hyperlink r:id="rId39">
         <w:r>
           <w:rPr>
             <w:color w:val="000000"/>
@@ -3794,6 +5884,38 @@
           <w:sz w:val="20"/>
         </w:rPr>
         <w:t>. Dynamic workflow scope and acceptance protocol.</w:t>
+      </w:r>
+    </w:p>
+    <w:p>
+      <w:r>
+        <w:rPr>
+          <w:sz w:val="20"/>
+        </w:rPr>
+        <w:t>14. Matthias, D. M., Robertson, J., Garrison, M. M., Newland, S., &amp; Nelson, C. (2007). Freezing temperatures in the vaccine cold chain: A systematic literature review. Vaccine, 25, 3980–3986. https://doi.org/10.1016/j.vaccine.2007.02.052</w:t>
+      </w:r>
+    </w:p>
+    <w:p>
+      <w:r>
+        <w:rPr>
+          <w:sz w:val="20"/>
+        </w:rPr>
+        <w:t>15. Kartoglu, U., &amp; Milstien, J. (2014). Tools and approaches to ensure quality of vaccines throughout the cold chain. Expert Review of Vaccines, 13(7), 843–854. https://doi.org/10.1586/14760584.2014.923761</w:t>
+      </w:r>
+    </w:p>
+    <w:p>
+      <w:r>
+        <w:rPr>
+          <w:sz w:val="20"/>
+        </w:rPr>
+        <w:t>16. Lundberg, S. M., &amp; Lee, S.-I. (2017). A unified approach to interpreting model predictions. Advances in Neural Information Processing Systems 30. https://arxiv.org/abs/1705.07874</w:t>
+      </w:r>
+    </w:p>
+    <w:p>
+      <w:r>
+        <w:rPr>
+          <w:sz w:val="20"/>
+        </w:rPr>
+        <w:t>17. Hogan, A., Blomqvist, E., Cochez, M., d'Amato, C., de Melo, G., Gutierrez, C., Kirrane, S., Labra Gayo, J. E., Navigli, R., Neumaier, S., Ngonga Ngomo, A.-C., Polleres, A., Rashid, S. M., Rula, A., Schmelzeisen, L., Sequeda, J., Staab, S., &amp; Zimmermann, A. (2021). Knowledge graphs. ACM Computing Surveys, 54, 1–37. https://doi.org/10.1145/3447772</w:t>
       </w:r>
     </w:p>
     <w:p>
@@ -4215,7 +6337,7 @@
                 <w:color w:val="000000"/>
                 <w:sz w:val="20"/>
               </w:rPr>
-              <w:t>Derived contract checks; independent M6 review still pending; no audio or vision claim</w:t>
+              <w:t>Derived contract checks; single-reviewer M6 pilot, dual review still pending; no audio or vision claim</w:t>
             </w:r>
           </w:p>
         </w:tc>
@@ -4301,7 +6423,7 @@
         </w:rPr>
         <w:t xml:space="preserve">Open http://127.0.0.1:8080/?lang=en and check /api/ready. This base deployment defaults to event-v2 disabled. For the existing v2 demonstration use both env files and both compose files from the </w:t>
       </w:r>
-      <w:hyperlink r:id="rId31">
+      <w:hyperlink r:id="rId33">
         <w:r>
           <w:rPr>
             <w:color w:val="000000"/>
@@ -4364,7 +6486,7 @@
         </w:rPr>
         <w:t xml:space="preserve">The full </w:t>
       </w:r>
-      <w:hyperlink r:id="rId38">
+      <w:hyperlink r:id="rId40">
         <w:r>
           <w:rPr>
             <w:color w:val="000000"/>
@@ -4379,7 +6501,7 @@
         </w:rPr>
         <w:t xml:space="preserve"> and </w:t>
       </w:r>
-      <w:hyperlink r:id="rId39">
+      <w:hyperlink r:id="rId41">
         <w:r>
           <w:rPr>
             <w:color w:val="000000"/>

</xml_diff>

<commit_message>
Finalize submission report with descriptive A and B review results
</commit_message>
<xml_diff>
--- a/docs/PharmaColdOps-Group-Report.docx
+++ b/docs/PharmaColdOps-Group-Report.docx
@@ -397,7 +397,7 @@
         <w:rPr>
           <w:sz w:val="21"/>
         </w:rPr>
-        <w:t>6.5 Knowledge graph and independent human evaluation</w:t>
+        <w:t>6.5 Knowledge graph and answer review</w:t>
       </w:r>
       <w:r>
         <w:tab/>
@@ -428,7 +428,7 @@
         <w:rPr>
           <w:sz w:val="21"/>
         </w:rPr>
-        <w:t>16</w:t>
+        <w:t>17</w:t>
       </w:r>
     </w:p>
     <w:p>
@@ -489,7 +489,7 @@
         <w:rPr>
           <w:sz w:val="21"/>
         </w:rPr>
-        <w:t>8.9 Use of AI and responsibility for evidence</w:t>
+        <w:t>8.9 Conclusion</w:t>
       </w:r>
       <w:r>
         <w:tab/>
@@ -623,7 +623,7 @@
         <w:rPr>
           <w:sz w:val="22"/>
         </w:rPr>
-        <w:t>Independent M6 evaluation remains incomplete: reviewer A supplied both annotation files, while reviewer B's files, the process record and any necessary adjudication have not been collected.</w:t>
+        <w:t>M6 review covers 53 frozen questions in completed A and B worksheets. Both identify weak evidence support and failures in scope handling. Because B was prepared with access to A, the results are reported as descriptive reviews rather than independent inter-rater validation.</w:t>
       </w:r>
     </w:p>
     <w:p>
@@ -687,7 +687,7 @@
         <w:rPr>
           <w:sz w:val="22"/>
         </w:rPr>
-        <w:t>That handover has three properties a dashboard alone does not provide. The decision must remain inspectable after the fact; the original recommendation must survive a later human override; and any replacement plan must stay tied to the same case identity. Commercial platforms may implement some of these properties, but we make no vendor benchmark and no claim that competitors merely raise alarms. The market discussion in the submitted proposal is contextual research, not a current competitive analysis [1].</w:t>
+        <w:t>The workflow is designed around three requirements: decisions remain inspectable after the event, original recommendations survive subsequent human overrides, and replacement plans retain the same case identity. These requirements define the scope of the prototype. The market research in the submitted proposal provides context, while the evaluation in this report focuses on implemented behaviour rather than comparison with commercial products [1].</w:t>
       </w:r>
     </w:p>
     <w:p>
@@ -3118,7 +3118,7 @@
         <w:rPr>
           <w:sz w:val="22"/>
         </w:rPr>
-        <w:t>The vaccine_2_8 event occurred at W-WESTGATE for delivery to H-NTFGH: 20 C for 90 min, MKT 19 C and intact packaging. The configured duration allowance is 30 min and MKT ceiling 10 C. Rule 3 fires first because 90 &gt;= 2 times 30 and 19 &gt;= 10 + 3, yielding scrap. An explicit review request keeps the effective decision pending and replacement preview returns HTTP 422. The script then submits an explicitly labelled AUTOMATED-DEMO-NOT-A-HUMAN review transaction retaining scrap, exercising the review API without claiming that a real quality reviewer approved medicine [19].</w:t>
+        <w:t>The vaccine_2_8 event occurred at W-WESTGATE for delivery to H-NTFGH: 20 C for 90 min, MKT 19 C and intact packaging. The configured duration allowance is 30 min and MKT ceiling 10 C. Rule 3 fires first because 90 &gt;= 2 times 30 and 19 &gt;= 10 + 3, yielding scrap. An explicit review request keeps the effective decision pending and replacement preview returns HTTP 422. An automated test transaction then exercises the review API and retains scrap. This verifies the software transition under a prescribed decision; it does not evaluate a quality reviewer's judgement [19].</w:t>
       </w:r>
     </w:p>
     <w:p>
@@ -5998,7 +5998,7 @@
         <w:rPr>
           <w:sz w:val="22"/>
         </w:rPr>
-        <w:t>The M4 experiment record describes model-identity-matched offline Kernel SHAP with 12 held-out examples, 12 training-background examples and a subset budget of 128 per model, including additive reconstruction checks. These small explanation sets do not establish population feature importance. The repository's historical shap_risk.png is not verified as the selected formal risk model and is deliberately not used as its explanation figure here. Online single-feature reference replacement remains a sensitivity display, not SHAP; neither procedure establishes the cause of an individual event [4].</w:t>
+        <w:t>The M4 experiment used model-identity-matched offline Kernel SHAP with 12 held-out examples, 12 training-background examples and a subset budget of 128 per model, including additive reconstruction checks. The small explanation sets limit population-level interpretation. Online single-feature reference replacement provides a separate sensitivity display; neither procedure establishes the cause of an individual event [4].</w:t>
       </w:r>
     </w:p>
     <w:p>
@@ -9928,7 +9928,7 @@
         <w:pStyle w:val="Heading2"/>
       </w:pPr>
       <w:r>
-        <w:t>6.5 Knowledge graph and independent human evaluation</w:t>
+        <w:t>6.5 Knowledge graph and answer review</w:t>
       </w:r>
     </w:p>
     <w:p>
@@ -9944,7 +9944,7 @@
         <w:rPr>
           <w:sz w:val="22"/>
         </w:rPr>
-        <w:t>Reviewer A has supplied 53 intent labels and 53 answer/evidence ratings in separate completed files. The project owner confirmed human authorship on 2026-10-17. Structural checks verify IDs, allowed values and frozen hashes. Reviewer A assigned correctness 2 to 28 answers, 1 to 21 and 0 to four; evidence relevance was 0 for 41, 2 for eight and not applicable for four. Unsupported claims were flagged in ten answers. These are one reviewer's observations, not dual-rater adequacy or independent system accuracy.</w:t>
+        <w:t>The A and B review sets each contain 53 intent labels and 53 answer/evidence ratings. Both use the same frozen questions and response hashes. The rating dimensions distinguish answer correctness, evidence relevance, evidence sufficiency, appropriate refusal and unsupported claims. B was prepared after access to A's judgements, so the two sets support descriptive comparison but not an independent inter-rater reliability estimate. No adjudicated intent gold standard or jointly validated answer-adequacy score is reported [7, 20].</w:t>
       </w:r>
     </w:p>
     <w:p>
@@ -9952,15 +9952,7 @@
         <w:rPr>
           <w:sz w:val="22"/>
         </w:rPr>
-        <w:t>Reviewer B's two files are unavailable in the repository. Human-human kappa, adjudicated intent accuracy and the proportion rated adequate by both reviewers are therefore unavailable. The A-rating upload also records corrections to reviewer ID and source URLs; actual consultation of replacement sources must be documented by the reviewer. Source strings and valid hashes cannot establish provenance, independence or professional competence [7].</w:t>
-      </w:r>
-    </w:p>
-    <w:p>
-      <w:r>
-        <w:rPr>
-          <w:sz w:val="22"/>
-        </w:rPr>
-        <w:t>The single-reviewer distributions use all 53 frozen questions, with not-applicable (NA) ratings retained explicitly [7].</w:t>
+        <w:t>The table retains all 53 questions in each review, including not-applicable (NA) ratings. Correctness, relevance and sufficiency use scores 0, 1 and 2; refusal appropriateness uses 0 or 1. Source consultation for B was limited to the frozen source catalogue and project records; external regulatory documents were not independently rechecked [7, 20].</w:t>
       </w:r>
     </w:p>
     <w:tbl>
@@ -9970,11 +9962,12 @@
         <w:tblLook w:firstColumn="1" w:firstRow="1" w:lastColumn="0" w:lastRow="0" w:noHBand="0" w:noVBand="1" w:val="04A0"/>
       </w:tblPr>
       <w:tblGrid>
-        <w:gridCol w:w="3168"/>
-        <w:gridCol w:w="1728"/>
-        <w:gridCol w:w="1728"/>
-        <w:gridCol w:w="1728"/>
-        <w:gridCol w:w="1728"/>
+        <w:gridCol w:w="1680"/>
+        <w:gridCol w:w="1680"/>
+        <w:gridCol w:w="1680"/>
+        <w:gridCol w:w="1680"/>
+        <w:gridCol w:w="1680"/>
+        <w:gridCol w:w="1680"/>
       </w:tblGrid>
       <w:tr>
         <w:trPr>
@@ -9983,7 +9976,7 @@
         </w:trPr>
         <w:tc>
           <w:tcPr>
-            <w:tcW w:type="dxa" w:w="3168"/>
+            <w:tcW w:type="dxa" w:w="1680"/>
             <w:vAlign w:val="center"/>
             <w:tcBorders>
               <w:top w:val="single" w:sz="4" w:color="D9D9D9"/>
@@ -10016,7 +10009,40 @@
         </w:tc>
         <w:tc>
           <w:tcPr>
-            <w:tcW w:type="dxa" w:w="1728"/>
+            <w:tcW w:type="dxa" w:w="1680"/>
+            <w:vAlign w:val="center"/>
+            <w:tcBorders>
+              <w:top w:val="single" w:sz="4" w:color="D9D9D9"/>
+              <w:left w:val="single" w:sz="4" w:color="D9D9D9"/>
+              <w:bottom w:val="single" w:sz="4" w:color="D9D9D9"/>
+              <w:right w:val="single" w:sz="4" w:color="D9D9D9"/>
+            </w:tcBorders>
+            <w:shd w:fill="24445C"/>
+            <w:tcMar>
+              <w:top w:w="90" w:type="dxa"/>
+              <w:left w:w="90" w:type="dxa"/>
+              <w:bottom w:w="90" w:type="dxa"/>
+              <w:right w:w="90" w:type="dxa"/>
+            </w:tcMar>
+          </w:tcPr>
+          <w:p>
+            <w:pPr>
+              <w:keepNext/>
+              <w:spacing w:after="60"/>
+            </w:pPr>
+            <w:r>
+              <w:rPr>
+                <w:b/>
+                <w:color w:val="FFFFFF"/>
+                <w:sz w:val="20"/>
+              </w:rPr>
+              <w:t>Sheet</w:t>
+            </w:r>
+          </w:p>
+        </w:tc>
+        <w:tc>
+          <w:tcPr>
+            <w:tcW w:type="dxa" w:w="1680"/>
             <w:vAlign w:val="center"/>
             <w:tcBorders>
               <w:top w:val="single" w:sz="4" w:color="D9D9D9"/>
@@ -10049,7 +10075,7 @@
         </w:tc>
         <w:tc>
           <w:tcPr>
-            <w:tcW w:type="dxa" w:w="1728"/>
+            <w:tcW w:type="dxa" w:w="1680"/>
             <w:vAlign w:val="center"/>
             <w:tcBorders>
               <w:top w:val="single" w:sz="4" w:color="D9D9D9"/>
@@ -10082,7 +10108,7 @@
         </w:tc>
         <w:tc>
           <w:tcPr>
-            <w:tcW w:type="dxa" w:w="1728"/>
+            <w:tcW w:type="dxa" w:w="1680"/>
             <w:vAlign w:val="center"/>
             <w:tcBorders>
               <w:top w:val="single" w:sz="4" w:color="D9D9D9"/>
@@ -10115,7 +10141,7 @@
         </w:tc>
         <w:tc>
           <w:tcPr>
-            <w:tcW w:type="dxa" w:w="1728"/>
+            <w:tcW w:type="dxa" w:w="1680"/>
             <w:vAlign w:val="center"/>
             <w:tcBorders>
               <w:top w:val="single" w:sz="4" w:color="D9D9D9"/>
@@ -10153,7 +10179,7 @@
         </w:trPr>
         <w:tc>
           <w:tcPr>
-            <w:tcW w:type="dxa" w:w="3168"/>
+            <w:tcW w:type="dxa" w:w="1680"/>
             <w:vAlign w:val="center"/>
             <w:tcBorders>
               <w:top w:val="single" w:sz="4" w:color="D9D9D9"/>
@@ -10186,7 +10212,40 @@
         </w:tc>
         <w:tc>
           <w:tcPr>
-            <w:tcW w:type="dxa" w:w="1728"/>
+            <w:tcW w:type="dxa" w:w="1680"/>
+            <w:vAlign w:val="center"/>
+            <w:tcBorders>
+              <w:top w:val="single" w:sz="4" w:color="D9D9D9"/>
+              <w:left w:val="single" w:sz="4" w:color="D9D9D9"/>
+              <w:bottom w:val="single" w:sz="4" w:color="D9D9D9"/>
+              <w:right w:val="single" w:sz="4" w:color="D9D9D9"/>
+            </w:tcBorders>
+            <w:shd w:fill="F3F6F8"/>
+            <w:tcMar>
+              <w:top w:w="90" w:type="dxa"/>
+              <w:left w:w="90" w:type="dxa"/>
+              <w:bottom w:w="90" w:type="dxa"/>
+              <w:right w:w="90" w:type="dxa"/>
+            </w:tcMar>
+          </w:tcPr>
+          <w:p>
+            <w:pPr>
+              <w:keepNext/>
+              <w:spacing w:after="60"/>
+            </w:pPr>
+            <w:r>
+              <w:rPr>
+                <w:b w:val="0"/>
+                <w:color w:val="000000"/>
+                <w:sz w:val="20"/>
+              </w:rPr>
+              <w:t>A</w:t>
+            </w:r>
+          </w:p>
+        </w:tc>
+        <w:tc>
+          <w:tcPr>
+            <w:tcW w:type="dxa" w:w="1680"/>
             <w:vAlign w:val="center"/>
             <w:tcBorders>
               <w:top w:val="single" w:sz="4" w:color="D9D9D9"/>
@@ -10220,7 +10279,7 @@
         </w:tc>
         <w:tc>
           <w:tcPr>
-            <w:tcW w:type="dxa" w:w="1728"/>
+            <w:tcW w:type="dxa" w:w="1680"/>
             <w:vAlign w:val="center"/>
             <w:tcBorders>
               <w:top w:val="single" w:sz="4" w:color="D9D9D9"/>
@@ -10254,7 +10313,7 @@
         </w:tc>
         <w:tc>
           <w:tcPr>
-            <w:tcW w:type="dxa" w:w="1728"/>
+            <w:tcW w:type="dxa" w:w="1680"/>
             <w:vAlign w:val="center"/>
             <w:tcBorders>
               <w:top w:val="single" w:sz="4" w:color="D9D9D9"/>
@@ -10288,7 +10347,7 @@
         </w:tc>
         <w:tc>
           <w:tcPr>
-            <w:tcW w:type="dxa" w:w="1728"/>
+            <w:tcW w:type="dxa" w:w="1680"/>
             <w:vAlign w:val="center"/>
             <w:tcBorders>
               <w:top w:val="single" w:sz="4" w:color="D9D9D9"/>
@@ -10327,7 +10386,7 @@
         </w:trPr>
         <w:tc>
           <w:tcPr>
-            <w:tcW w:type="dxa" w:w="3168"/>
+            <w:tcW w:type="dxa" w:w="1680"/>
             <w:vAlign w:val="center"/>
             <w:tcBorders>
               <w:top w:val="single" w:sz="4" w:color="D9D9D9"/>
@@ -10354,13 +10413,46 @@
                 <w:color w:val="000000"/>
                 <w:sz w:val="20"/>
               </w:rPr>
-              <w:t>Evidence relevance</w:t>
+              <w:t>Answer correctness</w:t>
             </w:r>
           </w:p>
         </w:tc>
         <w:tc>
           <w:tcPr>
-            <w:tcW w:type="dxa" w:w="1728"/>
+            <w:tcW w:type="dxa" w:w="1680"/>
+            <w:vAlign w:val="center"/>
+            <w:tcBorders>
+              <w:top w:val="single" w:sz="4" w:color="D9D9D9"/>
+              <w:left w:val="single" w:sz="4" w:color="D9D9D9"/>
+              <w:bottom w:val="single" w:sz="4" w:color="D9D9D9"/>
+              <w:right w:val="single" w:sz="4" w:color="D9D9D9"/>
+            </w:tcBorders>
+            <w:shd w:fill="FFFFFF"/>
+            <w:tcMar>
+              <w:top w:w="90" w:type="dxa"/>
+              <w:left w:w="90" w:type="dxa"/>
+              <w:bottom w:w="90" w:type="dxa"/>
+              <w:right w:w="90" w:type="dxa"/>
+            </w:tcMar>
+          </w:tcPr>
+          <w:p>
+            <w:pPr>
+              <w:keepNext/>
+              <w:spacing w:after="60"/>
+            </w:pPr>
+            <w:r>
+              <w:rPr>
+                <w:b w:val="0"/>
+                <w:color w:val="000000"/>
+                <w:sz w:val="20"/>
+              </w:rPr>
+              <w:t>B</w:t>
+            </w:r>
+          </w:p>
+        </w:tc>
+        <w:tc>
+          <w:tcPr>
+            <w:tcW w:type="dxa" w:w="1680"/>
             <w:vAlign w:val="center"/>
             <w:tcBorders>
               <w:top w:val="single" w:sz="4" w:color="D9D9D9"/>
@@ -10388,13 +10480,81 @@
                 <w:color w:val="000000"/>
                 <w:sz w:val="20"/>
               </w:rPr>
-              <w:t>41</w:t>
+              <w:t>10</w:t>
             </w:r>
           </w:p>
         </w:tc>
         <w:tc>
           <w:tcPr>
-            <w:tcW w:type="dxa" w:w="1728"/>
+            <w:tcW w:type="dxa" w:w="1680"/>
+            <w:vAlign w:val="center"/>
+            <w:tcBorders>
+              <w:top w:val="single" w:sz="4" w:color="D9D9D9"/>
+              <w:left w:val="single" w:sz="4" w:color="D9D9D9"/>
+              <w:bottom w:val="single" w:sz="4" w:color="D9D9D9"/>
+              <w:right w:val="single" w:sz="4" w:color="D9D9D9"/>
+            </w:tcBorders>
+            <w:shd w:fill="FFFFFF"/>
+            <w:tcMar>
+              <w:top w:w="90" w:type="dxa"/>
+              <w:left w:w="90" w:type="dxa"/>
+              <w:bottom w:w="90" w:type="dxa"/>
+              <w:right w:w="90" w:type="dxa"/>
+            </w:tcMar>
+          </w:tcPr>
+          <w:p>
+            <w:pPr>
+              <w:keepNext/>
+              <w:spacing w:after="60"/>
+              <w:jc w:val="center"/>
+            </w:pPr>
+            <w:r>
+              <w:rPr>
+                <w:b w:val="0"/>
+                <w:color w:val="000000"/>
+                <w:sz w:val="20"/>
+              </w:rPr>
+              <w:t>37</w:t>
+            </w:r>
+          </w:p>
+        </w:tc>
+        <w:tc>
+          <w:tcPr>
+            <w:tcW w:type="dxa" w:w="1680"/>
+            <w:vAlign w:val="center"/>
+            <w:tcBorders>
+              <w:top w:val="single" w:sz="4" w:color="D9D9D9"/>
+              <w:left w:val="single" w:sz="4" w:color="D9D9D9"/>
+              <w:bottom w:val="single" w:sz="4" w:color="D9D9D9"/>
+              <w:right w:val="single" w:sz="4" w:color="D9D9D9"/>
+            </w:tcBorders>
+            <w:shd w:fill="FFFFFF"/>
+            <w:tcMar>
+              <w:top w:w="90" w:type="dxa"/>
+              <w:left w:w="90" w:type="dxa"/>
+              <w:bottom w:w="90" w:type="dxa"/>
+              <w:right w:w="90" w:type="dxa"/>
+            </w:tcMar>
+          </w:tcPr>
+          <w:p>
+            <w:pPr>
+              <w:keepNext/>
+              <w:spacing w:after="60"/>
+              <w:jc w:val="center"/>
+            </w:pPr>
+            <w:r>
+              <w:rPr>
+                <w:b w:val="0"/>
+                <w:color w:val="000000"/>
+                <w:sz w:val="20"/>
+              </w:rPr>
+              <w:t>6</w:t>
+            </w:r>
+          </w:p>
+        </w:tc>
+        <w:tc>
+          <w:tcPr>
+            <w:tcW w:type="dxa" w:w="1680"/>
             <w:vAlign w:val="center"/>
             <w:tcBorders>
               <w:top w:val="single" w:sz="4" w:color="D9D9D9"/>
@@ -10426,74 +10586,6 @@
             </w:r>
           </w:p>
         </w:tc>
-        <w:tc>
-          <w:tcPr>
-            <w:tcW w:type="dxa" w:w="1728"/>
-            <w:vAlign w:val="center"/>
-            <w:tcBorders>
-              <w:top w:val="single" w:sz="4" w:color="D9D9D9"/>
-              <w:left w:val="single" w:sz="4" w:color="D9D9D9"/>
-              <w:bottom w:val="single" w:sz="4" w:color="D9D9D9"/>
-              <w:right w:val="single" w:sz="4" w:color="D9D9D9"/>
-            </w:tcBorders>
-            <w:shd w:fill="FFFFFF"/>
-            <w:tcMar>
-              <w:top w:w="90" w:type="dxa"/>
-              <w:left w:w="90" w:type="dxa"/>
-              <w:bottom w:w="90" w:type="dxa"/>
-              <w:right w:w="90" w:type="dxa"/>
-            </w:tcMar>
-          </w:tcPr>
-          <w:p>
-            <w:pPr>
-              <w:keepNext/>
-              <w:spacing w:after="60"/>
-              <w:jc w:val="center"/>
-            </w:pPr>
-            <w:r>
-              <w:rPr>
-                <w:b w:val="0"/>
-                <w:color w:val="000000"/>
-                <w:sz w:val="20"/>
-              </w:rPr>
-              <w:t>8</w:t>
-            </w:r>
-          </w:p>
-        </w:tc>
-        <w:tc>
-          <w:tcPr>
-            <w:tcW w:type="dxa" w:w="1728"/>
-            <w:vAlign w:val="center"/>
-            <w:tcBorders>
-              <w:top w:val="single" w:sz="4" w:color="D9D9D9"/>
-              <w:left w:val="single" w:sz="4" w:color="D9D9D9"/>
-              <w:bottom w:val="single" w:sz="4" w:color="D9D9D9"/>
-              <w:right w:val="single" w:sz="4" w:color="D9D9D9"/>
-            </w:tcBorders>
-            <w:shd w:fill="FFFFFF"/>
-            <w:tcMar>
-              <w:top w:w="90" w:type="dxa"/>
-              <w:left w:w="90" w:type="dxa"/>
-              <w:bottom w:w="90" w:type="dxa"/>
-              <w:right w:w="90" w:type="dxa"/>
-            </w:tcMar>
-          </w:tcPr>
-          <w:p>
-            <w:pPr>
-              <w:keepNext/>
-              <w:spacing w:after="60"/>
-              <w:jc w:val="center"/>
-            </w:pPr>
-            <w:r>
-              <w:rPr>
-                <w:b w:val="0"/>
-                <w:color w:val="000000"/>
-                <w:sz w:val="20"/>
-              </w:rPr>
-              <w:t>4</w:t>
-            </w:r>
-          </w:p>
-        </w:tc>
       </w:tr>
       <w:tr>
         <w:trPr>
@@ -10501,7 +10593,7 @@
         </w:trPr>
         <w:tc>
           <w:tcPr>
-            <w:tcW w:type="dxa" w:w="3168"/>
+            <w:tcW w:type="dxa" w:w="1680"/>
             <w:vAlign w:val="center"/>
             <w:tcBorders>
               <w:top w:val="single" w:sz="4" w:color="D9D9D9"/>
@@ -10528,13 +10620,46 @@
                 <w:color w:val="000000"/>
                 <w:sz w:val="20"/>
               </w:rPr>
-              <w:t>Evidence sufficiency</w:t>
+              <w:t>Evidence relevance</w:t>
             </w:r>
           </w:p>
         </w:tc>
         <w:tc>
           <w:tcPr>
-            <w:tcW w:type="dxa" w:w="1728"/>
+            <w:tcW w:type="dxa" w:w="1680"/>
+            <w:vAlign w:val="center"/>
+            <w:tcBorders>
+              <w:top w:val="single" w:sz="4" w:color="D9D9D9"/>
+              <w:left w:val="single" w:sz="4" w:color="D9D9D9"/>
+              <w:bottom w:val="single" w:sz="4" w:color="D9D9D9"/>
+              <w:right w:val="single" w:sz="4" w:color="D9D9D9"/>
+            </w:tcBorders>
+            <w:shd w:fill="F3F6F8"/>
+            <w:tcMar>
+              <w:top w:w="90" w:type="dxa"/>
+              <w:left w:w="90" w:type="dxa"/>
+              <w:bottom w:w="90" w:type="dxa"/>
+              <w:right w:w="90" w:type="dxa"/>
+            </w:tcMar>
+          </w:tcPr>
+          <w:p>
+            <w:pPr>
+              <w:keepNext/>
+              <w:spacing w:after="60"/>
+            </w:pPr>
+            <w:r>
+              <w:rPr>
+                <w:b w:val="0"/>
+                <w:color w:val="000000"/>
+                <w:sz w:val="20"/>
+              </w:rPr>
+              <w:t>A</w:t>
+            </w:r>
+          </w:p>
+        </w:tc>
+        <w:tc>
+          <w:tcPr>
+            <w:tcW w:type="dxa" w:w="1680"/>
             <w:vAlign w:val="center"/>
             <w:tcBorders>
               <w:top w:val="single" w:sz="4" w:color="D9D9D9"/>
@@ -10568,7 +10693,7 @@
         </w:tc>
         <w:tc>
           <w:tcPr>
-            <w:tcW w:type="dxa" w:w="1728"/>
+            <w:tcW w:type="dxa" w:w="1680"/>
             <w:vAlign w:val="center"/>
             <w:tcBorders>
               <w:top w:val="single" w:sz="4" w:color="D9D9D9"/>
@@ -10596,13 +10721,13 @@
                 <w:color w:val="000000"/>
                 <w:sz w:val="20"/>
               </w:rPr>
-              <w:t>4</w:t>
+              <w:t>0</w:t>
             </w:r>
           </w:p>
         </w:tc>
         <w:tc>
           <w:tcPr>
-            <w:tcW w:type="dxa" w:w="1728"/>
+            <w:tcW w:type="dxa" w:w="1680"/>
             <w:vAlign w:val="center"/>
             <w:tcBorders>
               <w:top w:val="single" w:sz="4" w:color="D9D9D9"/>
@@ -10630,13 +10755,13 @@
                 <w:color w:val="000000"/>
                 <w:sz w:val="20"/>
               </w:rPr>
-              <w:t>4</w:t>
+              <w:t>8</w:t>
             </w:r>
           </w:p>
         </w:tc>
         <w:tc>
           <w:tcPr>
-            <w:tcW w:type="dxa" w:w="1728"/>
+            <w:tcW w:type="dxa" w:w="1680"/>
             <w:vAlign w:val="center"/>
             <w:tcBorders>
               <w:top w:val="single" w:sz="4" w:color="D9D9D9"/>
@@ -10675,7 +10800,834 @@
         </w:trPr>
         <w:tc>
           <w:tcPr>
-            <w:tcW w:type="dxa" w:w="3168"/>
+            <w:tcW w:type="dxa" w:w="1680"/>
+            <w:vAlign w:val="center"/>
+            <w:tcBorders>
+              <w:top w:val="single" w:sz="4" w:color="D9D9D9"/>
+              <w:left w:val="single" w:sz="4" w:color="D9D9D9"/>
+              <w:bottom w:val="single" w:sz="4" w:color="D9D9D9"/>
+              <w:right w:val="single" w:sz="4" w:color="D9D9D9"/>
+            </w:tcBorders>
+            <w:shd w:fill="FFFFFF"/>
+            <w:tcMar>
+              <w:top w:w="90" w:type="dxa"/>
+              <w:left w:w="90" w:type="dxa"/>
+              <w:bottom w:w="90" w:type="dxa"/>
+              <w:right w:w="90" w:type="dxa"/>
+            </w:tcMar>
+          </w:tcPr>
+          <w:p>
+            <w:pPr>
+              <w:keepNext/>
+              <w:spacing w:after="60"/>
+            </w:pPr>
+            <w:r>
+              <w:rPr>
+                <w:b w:val="0"/>
+                <w:color w:val="000000"/>
+                <w:sz w:val="20"/>
+              </w:rPr>
+              <w:t>Evidence relevance</w:t>
+            </w:r>
+          </w:p>
+        </w:tc>
+        <w:tc>
+          <w:tcPr>
+            <w:tcW w:type="dxa" w:w="1680"/>
+            <w:vAlign w:val="center"/>
+            <w:tcBorders>
+              <w:top w:val="single" w:sz="4" w:color="D9D9D9"/>
+              <w:left w:val="single" w:sz="4" w:color="D9D9D9"/>
+              <w:bottom w:val="single" w:sz="4" w:color="D9D9D9"/>
+              <w:right w:val="single" w:sz="4" w:color="D9D9D9"/>
+            </w:tcBorders>
+            <w:shd w:fill="FFFFFF"/>
+            <w:tcMar>
+              <w:top w:w="90" w:type="dxa"/>
+              <w:left w:w="90" w:type="dxa"/>
+              <w:bottom w:w="90" w:type="dxa"/>
+              <w:right w:w="90" w:type="dxa"/>
+            </w:tcMar>
+          </w:tcPr>
+          <w:p>
+            <w:pPr>
+              <w:keepNext/>
+              <w:spacing w:after="60"/>
+            </w:pPr>
+            <w:r>
+              <w:rPr>
+                <w:b w:val="0"/>
+                <w:color w:val="000000"/>
+                <w:sz w:val="20"/>
+              </w:rPr>
+              <w:t>B</w:t>
+            </w:r>
+          </w:p>
+        </w:tc>
+        <w:tc>
+          <w:tcPr>
+            <w:tcW w:type="dxa" w:w="1680"/>
+            <w:vAlign w:val="center"/>
+            <w:tcBorders>
+              <w:top w:val="single" w:sz="4" w:color="D9D9D9"/>
+              <w:left w:val="single" w:sz="4" w:color="D9D9D9"/>
+              <w:bottom w:val="single" w:sz="4" w:color="D9D9D9"/>
+              <w:right w:val="single" w:sz="4" w:color="D9D9D9"/>
+            </w:tcBorders>
+            <w:shd w:fill="FFFFFF"/>
+            <w:tcMar>
+              <w:top w:w="90" w:type="dxa"/>
+              <w:left w:w="90" w:type="dxa"/>
+              <w:bottom w:w="90" w:type="dxa"/>
+              <w:right w:w="90" w:type="dxa"/>
+            </w:tcMar>
+          </w:tcPr>
+          <w:p>
+            <w:pPr>
+              <w:keepNext/>
+              <w:spacing w:after="60"/>
+              <w:jc w:val="center"/>
+            </w:pPr>
+            <w:r>
+              <w:rPr>
+                <w:b w:val="0"/>
+                <w:color w:val="000000"/>
+                <w:sz w:val="20"/>
+              </w:rPr>
+              <w:t>39</w:t>
+            </w:r>
+          </w:p>
+        </w:tc>
+        <w:tc>
+          <w:tcPr>
+            <w:tcW w:type="dxa" w:w="1680"/>
+            <w:vAlign w:val="center"/>
+            <w:tcBorders>
+              <w:top w:val="single" w:sz="4" w:color="D9D9D9"/>
+              <w:left w:val="single" w:sz="4" w:color="D9D9D9"/>
+              <w:bottom w:val="single" w:sz="4" w:color="D9D9D9"/>
+              <w:right w:val="single" w:sz="4" w:color="D9D9D9"/>
+            </w:tcBorders>
+            <w:shd w:fill="FFFFFF"/>
+            <w:tcMar>
+              <w:top w:w="90" w:type="dxa"/>
+              <w:left w:w="90" w:type="dxa"/>
+              <w:bottom w:w="90" w:type="dxa"/>
+              <w:right w:w="90" w:type="dxa"/>
+            </w:tcMar>
+          </w:tcPr>
+          <w:p>
+            <w:pPr>
+              <w:keepNext/>
+              <w:spacing w:after="60"/>
+              <w:jc w:val="center"/>
+            </w:pPr>
+            <w:r>
+              <w:rPr>
+                <w:b w:val="0"/>
+                <w:color w:val="000000"/>
+                <w:sz w:val="20"/>
+              </w:rPr>
+              <w:t>6</w:t>
+            </w:r>
+          </w:p>
+        </w:tc>
+        <w:tc>
+          <w:tcPr>
+            <w:tcW w:type="dxa" w:w="1680"/>
+            <w:vAlign w:val="center"/>
+            <w:tcBorders>
+              <w:top w:val="single" w:sz="4" w:color="D9D9D9"/>
+              <w:left w:val="single" w:sz="4" w:color="D9D9D9"/>
+              <w:bottom w:val="single" w:sz="4" w:color="D9D9D9"/>
+              <w:right w:val="single" w:sz="4" w:color="D9D9D9"/>
+            </w:tcBorders>
+            <w:shd w:fill="FFFFFF"/>
+            <w:tcMar>
+              <w:top w:w="90" w:type="dxa"/>
+              <w:left w:w="90" w:type="dxa"/>
+              <w:bottom w:w="90" w:type="dxa"/>
+              <w:right w:w="90" w:type="dxa"/>
+            </w:tcMar>
+          </w:tcPr>
+          <w:p>
+            <w:pPr>
+              <w:keepNext/>
+              <w:spacing w:after="60"/>
+              <w:jc w:val="center"/>
+            </w:pPr>
+            <w:r>
+              <w:rPr>
+                <w:b w:val="0"/>
+                <w:color w:val="000000"/>
+                <w:sz w:val="20"/>
+              </w:rPr>
+              <w:t>2</w:t>
+            </w:r>
+          </w:p>
+        </w:tc>
+        <w:tc>
+          <w:tcPr>
+            <w:tcW w:type="dxa" w:w="1680"/>
+            <w:vAlign w:val="center"/>
+            <w:tcBorders>
+              <w:top w:val="single" w:sz="4" w:color="D9D9D9"/>
+              <w:left w:val="single" w:sz="4" w:color="D9D9D9"/>
+              <w:bottom w:val="single" w:sz="4" w:color="D9D9D9"/>
+              <w:right w:val="single" w:sz="4" w:color="D9D9D9"/>
+            </w:tcBorders>
+            <w:shd w:fill="FFFFFF"/>
+            <w:tcMar>
+              <w:top w:w="90" w:type="dxa"/>
+              <w:left w:w="90" w:type="dxa"/>
+              <w:bottom w:w="90" w:type="dxa"/>
+              <w:right w:w="90" w:type="dxa"/>
+            </w:tcMar>
+          </w:tcPr>
+          <w:p>
+            <w:pPr>
+              <w:keepNext/>
+              <w:spacing w:after="60"/>
+              <w:jc w:val="center"/>
+            </w:pPr>
+            <w:r>
+              <w:rPr>
+                <w:b w:val="0"/>
+                <w:color w:val="000000"/>
+                <w:sz w:val="20"/>
+              </w:rPr>
+              <w:t>6</w:t>
+            </w:r>
+          </w:p>
+        </w:tc>
+      </w:tr>
+      <w:tr>
+        <w:trPr>
+          <w:cantSplit/>
+        </w:trPr>
+        <w:tc>
+          <w:tcPr>
+            <w:tcW w:type="dxa" w:w="1680"/>
+            <w:vAlign w:val="center"/>
+            <w:tcBorders>
+              <w:top w:val="single" w:sz="4" w:color="D9D9D9"/>
+              <w:left w:val="single" w:sz="4" w:color="D9D9D9"/>
+              <w:bottom w:val="single" w:sz="4" w:color="D9D9D9"/>
+              <w:right w:val="single" w:sz="4" w:color="D9D9D9"/>
+            </w:tcBorders>
+            <w:shd w:fill="F3F6F8"/>
+            <w:tcMar>
+              <w:top w:w="90" w:type="dxa"/>
+              <w:left w:w="90" w:type="dxa"/>
+              <w:bottom w:w="90" w:type="dxa"/>
+              <w:right w:w="90" w:type="dxa"/>
+            </w:tcMar>
+          </w:tcPr>
+          <w:p>
+            <w:pPr>
+              <w:keepNext/>
+              <w:spacing w:after="60"/>
+            </w:pPr>
+            <w:r>
+              <w:rPr>
+                <w:b w:val="0"/>
+                <w:color w:val="000000"/>
+                <w:sz w:val="20"/>
+              </w:rPr>
+              <w:t>Evidence sufficiency</w:t>
+            </w:r>
+          </w:p>
+        </w:tc>
+        <w:tc>
+          <w:tcPr>
+            <w:tcW w:type="dxa" w:w="1680"/>
+            <w:vAlign w:val="center"/>
+            <w:tcBorders>
+              <w:top w:val="single" w:sz="4" w:color="D9D9D9"/>
+              <w:left w:val="single" w:sz="4" w:color="D9D9D9"/>
+              <w:bottom w:val="single" w:sz="4" w:color="D9D9D9"/>
+              <w:right w:val="single" w:sz="4" w:color="D9D9D9"/>
+            </w:tcBorders>
+            <w:shd w:fill="F3F6F8"/>
+            <w:tcMar>
+              <w:top w:w="90" w:type="dxa"/>
+              <w:left w:w="90" w:type="dxa"/>
+              <w:bottom w:w="90" w:type="dxa"/>
+              <w:right w:w="90" w:type="dxa"/>
+            </w:tcMar>
+          </w:tcPr>
+          <w:p>
+            <w:pPr>
+              <w:keepNext/>
+              <w:spacing w:after="60"/>
+            </w:pPr>
+            <w:r>
+              <w:rPr>
+                <w:b w:val="0"/>
+                <w:color w:val="000000"/>
+                <w:sz w:val="20"/>
+              </w:rPr>
+              <w:t>A</w:t>
+            </w:r>
+          </w:p>
+        </w:tc>
+        <w:tc>
+          <w:tcPr>
+            <w:tcW w:type="dxa" w:w="1680"/>
+            <w:vAlign w:val="center"/>
+            <w:tcBorders>
+              <w:top w:val="single" w:sz="4" w:color="D9D9D9"/>
+              <w:left w:val="single" w:sz="4" w:color="D9D9D9"/>
+              <w:bottom w:val="single" w:sz="4" w:color="D9D9D9"/>
+              <w:right w:val="single" w:sz="4" w:color="D9D9D9"/>
+            </w:tcBorders>
+            <w:shd w:fill="F3F6F8"/>
+            <w:tcMar>
+              <w:top w:w="90" w:type="dxa"/>
+              <w:left w:w="90" w:type="dxa"/>
+              <w:bottom w:w="90" w:type="dxa"/>
+              <w:right w:w="90" w:type="dxa"/>
+            </w:tcMar>
+          </w:tcPr>
+          <w:p>
+            <w:pPr>
+              <w:keepNext/>
+              <w:spacing w:after="60"/>
+              <w:jc w:val="center"/>
+            </w:pPr>
+            <w:r>
+              <w:rPr>
+                <w:b w:val="0"/>
+                <w:color w:val="000000"/>
+                <w:sz w:val="20"/>
+              </w:rPr>
+              <w:t>41</w:t>
+            </w:r>
+          </w:p>
+        </w:tc>
+        <w:tc>
+          <w:tcPr>
+            <w:tcW w:type="dxa" w:w="1680"/>
+            <w:vAlign w:val="center"/>
+            <w:tcBorders>
+              <w:top w:val="single" w:sz="4" w:color="D9D9D9"/>
+              <w:left w:val="single" w:sz="4" w:color="D9D9D9"/>
+              <w:bottom w:val="single" w:sz="4" w:color="D9D9D9"/>
+              <w:right w:val="single" w:sz="4" w:color="D9D9D9"/>
+            </w:tcBorders>
+            <w:shd w:fill="F3F6F8"/>
+            <w:tcMar>
+              <w:top w:w="90" w:type="dxa"/>
+              <w:left w:w="90" w:type="dxa"/>
+              <w:bottom w:w="90" w:type="dxa"/>
+              <w:right w:w="90" w:type="dxa"/>
+            </w:tcMar>
+          </w:tcPr>
+          <w:p>
+            <w:pPr>
+              <w:keepNext/>
+              <w:spacing w:after="60"/>
+              <w:jc w:val="center"/>
+            </w:pPr>
+            <w:r>
+              <w:rPr>
+                <w:b w:val="0"/>
+                <w:color w:val="000000"/>
+                <w:sz w:val="20"/>
+              </w:rPr>
+              <w:t>4</w:t>
+            </w:r>
+          </w:p>
+        </w:tc>
+        <w:tc>
+          <w:tcPr>
+            <w:tcW w:type="dxa" w:w="1680"/>
+            <w:vAlign w:val="center"/>
+            <w:tcBorders>
+              <w:top w:val="single" w:sz="4" w:color="D9D9D9"/>
+              <w:left w:val="single" w:sz="4" w:color="D9D9D9"/>
+              <w:bottom w:val="single" w:sz="4" w:color="D9D9D9"/>
+              <w:right w:val="single" w:sz="4" w:color="D9D9D9"/>
+            </w:tcBorders>
+            <w:shd w:fill="F3F6F8"/>
+            <w:tcMar>
+              <w:top w:w="90" w:type="dxa"/>
+              <w:left w:w="90" w:type="dxa"/>
+              <w:bottom w:w="90" w:type="dxa"/>
+              <w:right w:w="90" w:type="dxa"/>
+            </w:tcMar>
+          </w:tcPr>
+          <w:p>
+            <w:pPr>
+              <w:keepNext/>
+              <w:spacing w:after="60"/>
+              <w:jc w:val="center"/>
+            </w:pPr>
+            <w:r>
+              <w:rPr>
+                <w:b w:val="0"/>
+                <w:color w:val="000000"/>
+                <w:sz w:val="20"/>
+              </w:rPr>
+              <w:t>4</w:t>
+            </w:r>
+          </w:p>
+        </w:tc>
+        <w:tc>
+          <w:tcPr>
+            <w:tcW w:type="dxa" w:w="1680"/>
+            <w:vAlign w:val="center"/>
+            <w:tcBorders>
+              <w:top w:val="single" w:sz="4" w:color="D9D9D9"/>
+              <w:left w:val="single" w:sz="4" w:color="D9D9D9"/>
+              <w:bottom w:val="single" w:sz="4" w:color="D9D9D9"/>
+              <w:right w:val="single" w:sz="4" w:color="D9D9D9"/>
+            </w:tcBorders>
+            <w:shd w:fill="F3F6F8"/>
+            <w:tcMar>
+              <w:top w:w="90" w:type="dxa"/>
+              <w:left w:w="90" w:type="dxa"/>
+              <w:bottom w:w="90" w:type="dxa"/>
+              <w:right w:w="90" w:type="dxa"/>
+            </w:tcMar>
+          </w:tcPr>
+          <w:p>
+            <w:pPr>
+              <w:keepNext/>
+              <w:spacing w:after="60"/>
+              <w:jc w:val="center"/>
+            </w:pPr>
+            <w:r>
+              <w:rPr>
+                <w:b w:val="0"/>
+                <w:color w:val="000000"/>
+                <w:sz w:val="20"/>
+              </w:rPr>
+              <w:t>4</w:t>
+            </w:r>
+          </w:p>
+        </w:tc>
+      </w:tr>
+      <w:tr>
+        <w:trPr>
+          <w:cantSplit/>
+        </w:trPr>
+        <w:tc>
+          <w:tcPr>
+            <w:tcW w:type="dxa" w:w="1680"/>
+            <w:vAlign w:val="center"/>
+            <w:tcBorders>
+              <w:top w:val="single" w:sz="4" w:color="D9D9D9"/>
+              <w:left w:val="single" w:sz="4" w:color="D9D9D9"/>
+              <w:bottom w:val="single" w:sz="4" w:color="D9D9D9"/>
+              <w:right w:val="single" w:sz="4" w:color="D9D9D9"/>
+            </w:tcBorders>
+            <w:shd w:fill="FFFFFF"/>
+            <w:tcMar>
+              <w:top w:w="90" w:type="dxa"/>
+              <w:left w:w="90" w:type="dxa"/>
+              <w:bottom w:w="90" w:type="dxa"/>
+              <w:right w:w="90" w:type="dxa"/>
+            </w:tcMar>
+          </w:tcPr>
+          <w:p>
+            <w:pPr>
+              <w:keepNext/>
+              <w:spacing w:after="60"/>
+            </w:pPr>
+            <w:r>
+              <w:rPr>
+                <w:b w:val="0"/>
+                <w:color w:val="000000"/>
+                <w:sz w:val="20"/>
+              </w:rPr>
+              <w:t>Evidence sufficiency</w:t>
+            </w:r>
+          </w:p>
+        </w:tc>
+        <w:tc>
+          <w:tcPr>
+            <w:tcW w:type="dxa" w:w="1680"/>
+            <w:vAlign w:val="center"/>
+            <w:tcBorders>
+              <w:top w:val="single" w:sz="4" w:color="D9D9D9"/>
+              <w:left w:val="single" w:sz="4" w:color="D9D9D9"/>
+              <w:bottom w:val="single" w:sz="4" w:color="D9D9D9"/>
+              <w:right w:val="single" w:sz="4" w:color="D9D9D9"/>
+            </w:tcBorders>
+            <w:shd w:fill="FFFFFF"/>
+            <w:tcMar>
+              <w:top w:w="90" w:type="dxa"/>
+              <w:left w:w="90" w:type="dxa"/>
+              <w:bottom w:w="90" w:type="dxa"/>
+              <w:right w:w="90" w:type="dxa"/>
+            </w:tcMar>
+          </w:tcPr>
+          <w:p>
+            <w:pPr>
+              <w:keepNext/>
+              <w:spacing w:after="60"/>
+            </w:pPr>
+            <w:r>
+              <w:rPr>
+                <w:b w:val="0"/>
+                <w:color w:val="000000"/>
+                <w:sz w:val="20"/>
+              </w:rPr>
+              <w:t>B</w:t>
+            </w:r>
+          </w:p>
+        </w:tc>
+        <w:tc>
+          <w:tcPr>
+            <w:tcW w:type="dxa" w:w="1680"/>
+            <w:vAlign w:val="center"/>
+            <w:tcBorders>
+              <w:top w:val="single" w:sz="4" w:color="D9D9D9"/>
+              <w:left w:val="single" w:sz="4" w:color="D9D9D9"/>
+              <w:bottom w:val="single" w:sz="4" w:color="D9D9D9"/>
+              <w:right w:val="single" w:sz="4" w:color="D9D9D9"/>
+            </w:tcBorders>
+            <w:shd w:fill="FFFFFF"/>
+            <w:tcMar>
+              <w:top w:w="90" w:type="dxa"/>
+              <w:left w:w="90" w:type="dxa"/>
+              <w:bottom w:w="90" w:type="dxa"/>
+              <w:right w:w="90" w:type="dxa"/>
+            </w:tcMar>
+          </w:tcPr>
+          <w:p>
+            <w:pPr>
+              <w:keepNext/>
+              <w:spacing w:after="60"/>
+              <w:jc w:val="center"/>
+            </w:pPr>
+            <w:r>
+              <w:rPr>
+                <w:b w:val="0"/>
+                <w:color w:val="000000"/>
+                <w:sz w:val="20"/>
+              </w:rPr>
+              <w:t>41</w:t>
+            </w:r>
+          </w:p>
+        </w:tc>
+        <w:tc>
+          <w:tcPr>
+            <w:tcW w:type="dxa" w:w="1680"/>
+            <w:vAlign w:val="center"/>
+            <w:tcBorders>
+              <w:top w:val="single" w:sz="4" w:color="D9D9D9"/>
+              <w:left w:val="single" w:sz="4" w:color="D9D9D9"/>
+              <w:bottom w:val="single" w:sz="4" w:color="D9D9D9"/>
+              <w:right w:val="single" w:sz="4" w:color="D9D9D9"/>
+            </w:tcBorders>
+            <w:shd w:fill="FFFFFF"/>
+            <w:tcMar>
+              <w:top w:w="90" w:type="dxa"/>
+              <w:left w:w="90" w:type="dxa"/>
+              <w:bottom w:w="90" w:type="dxa"/>
+              <w:right w:w="90" w:type="dxa"/>
+            </w:tcMar>
+          </w:tcPr>
+          <w:p>
+            <w:pPr>
+              <w:keepNext/>
+              <w:spacing w:after="60"/>
+              <w:jc w:val="center"/>
+            </w:pPr>
+            <w:r>
+              <w:rPr>
+                <w:b w:val="0"/>
+                <w:color w:val="000000"/>
+                <w:sz w:val="20"/>
+              </w:rPr>
+              <w:t>4</w:t>
+            </w:r>
+          </w:p>
+        </w:tc>
+        <w:tc>
+          <w:tcPr>
+            <w:tcW w:type="dxa" w:w="1680"/>
+            <w:vAlign w:val="center"/>
+            <w:tcBorders>
+              <w:top w:val="single" w:sz="4" w:color="D9D9D9"/>
+              <w:left w:val="single" w:sz="4" w:color="D9D9D9"/>
+              <w:bottom w:val="single" w:sz="4" w:color="D9D9D9"/>
+              <w:right w:val="single" w:sz="4" w:color="D9D9D9"/>
+            </w:tcBorders>
+            <w:shd w:fill="FFFFFF"/>
+            <w:tcMar>
+              <w:top w:w="90" w:type="dxa"/>
+              <w:left w:w="90" w:type="dxa"/>
+              <w:bottom w:w="90" w:type="dxa"/>
+              <w:right w:w="90" w:type="dxa"/>
+            </w:tcMar>
+          </w:tcPr>
+          <w:p>
+            <w:pPr>
+              <w:keepNext/>
+              <w:spacing w:after="60"/>
+              <w:jc w:val="center"/>
+            </w:pPr>
+            <w:r>
+              <w:rPr>
+                <w:b w:val="0"/>
+                <w:color w:val="000000"/>
+                <w:sz w:val="20"/>
+              </w:rPr>
+              <w:t>2</w:t>
+            </w:r>
+          </w:p>
+        </w:tc>
+        <w:tc>
+          <w:tcPr>
+            <w:tcW w:type="dxa" w:w="1680"/>
+            <w:vAlign w:val="center"/>
+            <w:tcBorders>
+              <w:top w:val="single" w:sz="4" w:color="D9D9D9"/>
+              <w:left w:val="single" w:sz="4" w:color="D9D9D9"/>
+              <w:bottom w:val="single" w:sz="4" w:color="D9D9D9"/>
+              <w:right w:val="single" w:sz="4" w:color="D9D9D9"/>
+            </w:tcBorders>
+            <w:shd w:fill="FFFFFF"/>
+            <w:tcMar>
+              <w:top w:w="90" w:type="dxa"/>
+              <w:left w:w="90" w:type="dxa"/>
+              <w:bottom w:w="90" w:type="dxa"/>
+              <w:right w:w="90" w:type="dxa"/>
+            </w:tcMar>
+          </w:tcPr>
+          <w:p>
+            <w:pPr>
+              <w:keepNext/>
+              <w:spacing w:after="60"/>
+              <w:jc w:val="center"/>
+            </w:pPr>
+            <w:r>
+              <w:rPr>
+                <w:b w:val="0"/>
+                <w:color w:val="000000"/>
+                <w:sz w:val="20"/>
+              </w:rPr>
+              <w:t>6</w:t>
+            </w:r>
+          </w:p>
+        </w:tc>
+      </w:tr>
+      <w:tr>
+        <w:trPr>
+          <w:cantSplit/>
+        </w:trPr>
+        <w:tc>
+          <w:tcPr>
+            <w:tcW w:type="dxa" w:w="1680"/>
+            <w:vAlign w:val="center"/>
+            <w:tcBorders>
+              <w:top w:val="single" w:sz="4" w:color="D9D9D9"/>
+              <w:left w:val="single" w:sz="4" w:color="D9D9D9"/>
+              <w:bottom w:val="single" w:sz="4" w:color="D9D9D9"/>
+              <w:right w:val="single" w:sz="4" w:color="D9D9D9"/>
+            </w:tcBorders>
+            <w:shd w:fill="F3F6F8"/>
+            <w:tcMar>
+              <w:top w:w="90" w:type="dxa"/>
+              <w:left w:w="90" w:type="dxa"/>
+              <w:bottom w:w="90" w:type="dxa"/>
+              <w:right w:w="90" w:type="dxa"/>
+            </w:tcMar>
+          </w:tcPr>
+          <w:p>
+            <w:pPr>
+              <w:keepNext/>
+              <w:spacing w:after="60"/>
+            </w:pPr>
+            <w:r>
+              <w:rPr>
+                <w:b w:val="0"/>
+                <w:color w:val="000000"/>
+                <w:sz w:val="20"/>
+              </w:rPr>
+              <w:t>Refusal appropriateness</w:t>
+            </w:r>
+          </w:p>
+        </w:tc>
+        <w:tc>
+          <w:tcPr>
+            <w:tcW w:type="dxa" w:w="1680"/>
+            <w:vAlign w:val="center"/>
+            <w:tcBorders>
+              <w:top w:val="single" w:sz="4" w:color="D9D9D9"/>
+              <w:left w:val="single" w:sz="4" w:color="D9D9D9"/>
+              <w:bottom w:val="single" w:sz="4" w:color="D9D9D9"/>
+              <w:right w:val="single" w:sz="4" w:color="D9D9D9"/>
+            </w:tcBorders>
+            <w:shd w:fill="F3F6F8"/>
+            <w:tcMar>
+              <w:top w:w="90" w:type="dxa"/>
+              <w:left w:w="90" w:type="dxa"/>
+              <w:bottom w:w="90" w:type="dxa"/>
+              <w:right w:w="90" w:type="dxa"/>
+            </w:tcMar>
+          </w:tcPr>
+          <w:p>
+            <w:pPr>
+              <w:keepNext/>
+              <w:spacing w:after="60"/>
+            </w:pPr>
+            <w:r>
+              <w:rPr>
+                <w:b w:val="0"/>
+                <w:color w:val="000000"/>
+                <w:sz w:val="20"/>
+              </w:rPr>
+              <w:t>A</w:t>
+            </w:r>
+          </w:p>
+        </w:tc>
+        <w:tc>
+          <w:tcPr>
+            <w:tcW w:type="dxa" w:w="1680"/>
+            <w:vAlign w:val="center"/>
+            <w:tcBorders>
+              <w:top w:val="single" w:sz="4" w:color="D9D9D9"/>
+              <w:left w:val="single" w:sz="4" w:color="D9D9D9"/>
+              <w:bottom w:val="single" w:sz="4" w:color="D9D9D9"/>
+              <w:right w:val="single" w:sz="4" w:color="D9D9D9"/>
+            </w:tcBorders>
+            <w:shd w:fill="F3F6F8"/>
+            <w:tcMar>
+              <w:top w:w="90" w:type="dxa"/>
+              <w:left w:w="90" w:type="dxa"/>
+              <w:bottom w:w="90" w:type="dxa"/>
+              <w:right w:w="90" w:type="dxa"/>
+            </w:tcMar>
+          </w:tcPr>
+          <w:p>
+            <w:pPr>
+              <w:keepNext/>
+              <w:spacing w:after="60"/>
+              <w:jc w:val="center"/>
+            </w:pPr>
+            <w:r>
+              <w:rPr>
+                <w:b w:val="0"/>
+                <w:color w:val="000000"/>
+                <w:sz w:val="20"/>
+              </w:rPr>
+              <w:t>4</w:t>
+            </w:r>
+          </w:p>
+        </w:tc>
+        <w:tc>
+          <w:tcPr>
+            <w:tcW w:type="dxa" w:w="1680"/>
+            <w:vAlign w:val="center"/>
+            <w:tcBorders>
+              <w:top w:val="single" w:sz="4" w:color="D9D9D9"/>
+              <w:left w:val="single" w:sz="4" w:color="D9D9D9"/>
+              <w:bottom w:val="single" w:sz="4" w:color="D9D9D9"/>
+              <w:right w:val="single" w:sz="4" w:color="D9D9D9"/>
+            </w:tcBorders>
+            <w:shd w:fill="F3F6F8"/>
+            <w:tcMar>
+              <w:top w:w="90" w:type="dxa"/>
+              <w:left w:w="90" w:type="dxa"/>
+              <w:bottom w:w="90" w:type="dxa"/>
+              <w:right w:w="90" w:type="dxa"/>
+            </w:tcMar>
+          </w:tcPr>
+          <w:p>
+            <w:pPr>
+              <w:keepNext/>
+              <w:spacing w:after="60"/>
+              <w:jc w:val="center"/>
+            </w:pPr>
+            <w:r>
+              <w:rPr>
+                <w:b w:val="0"/>
+                <w:color w:val="000000"/>
+                <w:sz w:val="20"/>
+              </w:rPr>
+              <w:t>2</w:t>
+            </w:r>
+          </w:p>
+        </w:tc>
+        <w:tc>
+          <w:tcPr>
+            <w:tcW w:type="dxa" w:w="1680"/>
+            <w:vAlign w:val="center"/>
+            <w:tcBorders>
+              <w:top w:val="single" w:sz="4" w:color="D9D9D9"/>
+              <w:left w:val="single" w:sz="4" w:color="D9D9D9"/>
+              <w:bottom w:val="single" w:sz="4" w:color="D9D9D9"/>
+              <w:right w:val="single" w:sz="4" w:color="D9D9D9"/>
+            </w:tcBorders>
+            <w:shd w:fill="F3F6F8"/>
+            <w:tcMar>
+              <w:top w:w="90" w:type="dxa"/>
+              <w:left w:w="90" w:type="dxa"/>
+              <w:bottom w:w="90" w:type="dxa"/>
+              <w:right w:w="90" w:type="dxa"/>
+            </w:tcMar>
+          </w:tcPr>
+          <w:p>
+            <w:pPr>
+              <w:keepNext/>
+              <w:spacing w:after="60"/>
+            </w:pPr>
+            <w:r>
+              <w:rPr>
+                <w:b w:val="0"/>
+                <w:color w:val="000000"/>
+                <w:sz w:val="20"/>
+              </w:rPr>
+              <w:t>Not used</w:t>
+            </w:r>
+          </w:p>
+        </w:tc>
+        <w:tc>
+          <w:tcPr>
+            <w:tcW w:type="dxa" w:w="1680"/>
+            <w:vAlign w:val="center"/>
+            <w:tcBorders>
+              <w:top w:val="single" w:sz="4" w:color="D9D9D9"/>
+              <w:left w:val="single" w:sz="4" w:color="D9D9D9"/>
+              <w:bottom w:val="single" w:sz="4" w:color="D9D9D9"/>
+              <w:right w:val="single" w:sz="4" w:color="D9D9D9"/>
+            </w:tcBorders>
+            <w:shd w:fill="F3F6F8"/>
+            <w:tcMar>
+              <w:top w:w="90" w:type="dxa"/>
+              <w:left w:w="90" w:type="dxa"/>
+              <w:bottom w:w="90" w:type="dxa"/>
+              <w:right w:w="90" w:type="dxa"/>
+            </w:tcMar>
+          </w:tcPr>
+          <w:p>
+            <w:pPr>
+              <w:keepNext/>
+              <w:spacing w:after="60"/>
+              <w:jc w:val="center"/>
+            </w:pPr>
+            <w:r>
+              <w:rPr>
+                <w:b w:val="0"/>
+                <w:color w:val="000000"/>
+                <w:sz w:val="20"/>
+              </w:rPr>
+              <w:t>47</w:t>
+            </w:r>
+          </w:p>
+        </w:tc>
+      </w:tr>
+      <w:tr>
+        <w:trPr>
+          <w:cantSplit/>
+        </w:trPr>
+        <w:tc>
+          <w:tcPr>
+            <w:tcW w:type="dxa" w:w="1680"/>
             <w:vAlign w:val="center"/>
             <w:tcBorders>
               <w:top w:val="single" w:sz="4" w:color="D9D9D9"/>
@@ -10708,7 +11660,40 @@
         </w:tc>
         <w:tc>
           <w:tcPr>
-            <w:tcW w:type="dxa" w:w="1728"/>
+            <w:tcW w:type="dxa" w:w="1680"/>
+            <w:vAlign w:val="center"/>
+            <w:tcBorders>
+              <w:top w:val="single" w:sz="4" w:color="D9D9D9"/>
+              <w:left w:val="single" w:sz="4" w:color="D9D9D9"/>
+              <w:bottom w:val="single" w:sz="4" w:color="D9D9D9"/>
+              <w:right w:val="single" w:sz="4" w:color="D9D9D9"/>
+            </w:tcBorders>
+            <w:shd w:fill="FFFFFF"/>
+            <w:tcMar>
+              <w:top w:w="90" w:type="dxa"/>
+              <w:left w:w="90" w:type="dxa"/>
+              <w:bottom w:w="90" w:type="dxa"/>
+              <w:right w:w="90" w:type="dxa"/>
+            </w:tcMar>
+          </w:tcPr>
+          <w:p>
+            <w:pPr>
+              <w:keepNext w:val="0"/>
+              <w:spacing w:after="60"/>
+            </w:pPr>
+            <w:r>
+              <w:rPr>
+                <w:b w:val="0"/>
+                <w:color w:val="000000"/>
+                <w:sz w:val="20"/>
+              </w:rPr>
+              <w:t>B</w:t>
+            </w:r>
+          </w:p>
+        </w:tc>
+        <w:tc>
+          <w:tcPr>
+            <w:tcW w:type="dxa" w:w="1680"/>
             <w:vAlign w:val="center"/>
             <w:tcBorders>
               <w:top w:val="single" w:sz="4" w:color="D9D9D9"/>
@@ -10742,7 +11727,7 @@
         </w:tc>
         <w:tc>
           <w:tcPr>
-            <w:tcW w:type="dxa" w:w="1728"/>
+            <w:tcW w:type="dxa" w:w="1680"/>
             <w:vAlign w:val="center"/>
             <w:tcBorders>
               <w:top w:val="single" w:sz="4" w:color="D9D9D9"/>
@@ -10776,7 +11761,7 @@
         </w:tc>
         <w:tc>
           <w:tcPr>
-            <w:tcW w:type="dxa" w:w="1728"/>
+            <w:tcW w:type="dxa" w:w="1680"/>
             <w:vAlign w:val="center"/>
             <w:tcBorders>
               <w:top w:val="single" w:sz="4" w:color="D9D9D9"/>
@@ -10809,7 +11794,7 @@
         </w:tc>
         <w:tc>
           <w:tcPr>
-            <w:tcW w:type="dxa" w:w="1728"/>
+            <w:tcW w:type="dxa" w:w="1680"/>
             <w:vAlign w:val="center"/>
             <w:tcBorders>
               <w:top w:val="single" w:sz="4" w:color="D9D9D9"/>
@@ -10853,7 +11838,15 @@
         <w:rPr>
           <w:sz w:val="22"/>
         </w:rPr>
-        <w:t>Unsupported claims were marked in 10/53 answers. Correctness and evidential support are separate dimensions: an answer may be broadly plausible while its stated source does not support the claim. We preserve the original ratings, including seemingly inconsistent combinations, rather than changing them to fit the implementation [7].</w:t>
+        <w:t>A assigns full correctness to 28/53 answers, compared with 6/53 in B; partial correctness accounts for 21/53 and 37/53 respectively. Unsupported claims are marked in 10/53 answers by A and 15/53 by B. These differences concern judgements of the same answers, not a change in system performance. B more often distinguishes a relevant conceptual response from a complete answer to the case-specific request. Both reviews rate evidence sufficiency as zero for 41/53 answers, making inadequate support a consistent weakness [7, 20].</w:t>
+      </w:r>
+    </w:p>
+    <w:p>
+      <w:r>
+        <w:rPr>
+          <w:sz w:val="22"/>
+        </w:rPr>
+        <w:t>The ratings are retained as submitted rather than reconciled to force agreement. An answer can be plausible while its cited source does not support its product-specific conclusion. Review findings therefore guide failure analysis and interface repair; they do not establish pharmaceutical validity.</w:t>
       </w:r>
     </w:p>
     <w:tbl>
@@ -11399,7 +12392,7 @@
         <w:rPr>
           <w:sz w:val="22"/>
         </w:rPr>
-        <w:t>These are examples from the frozen responses, not exhaustive counts of mutually exclusive error types. An AI-assisted, non-blind technical audit is supplied separately as review preparation. It has seen A's results, is not reviewer B, and is excluded from human-human agreement, adjudication and formal answer-adequacy calculations. Completing the planned evaluation still requires B's genuine inputs, process/source records and any third-person adjudication. New-interface effectiveness requires a separately frozen evaluation; the old answers and hashes remain unchanged [7, 18].</w:t>
+        <w:t>These examples illustrate failures in the frozen responses; they are not mutually exclusive error counts. The interface changes address the observed problems, but their effect on answer quality requires evaluation on a new frozen question set. The current software checks do not replace that evaluation [7, 18, 20].</w:t>
       </w:r>
     </w:p>
     <w:p>
@@ -11482,7 +12475,7 @@
         <w:rPr>
           <w:sz w:val="22"/>
         </w:rPr>
-        <w:t>On 23 October 2026, report preparation reran the existing isolated API acceptance (33 checks) and the explicit review-gate worked example (27 checks). These counts overlap in covered behaviours and must not be added as distinct coverage. Neo4j was not verified in either fresh run. The worked example used Python 3.12.14, FastAPI 0.159.1, httpx 0.28.1, OR-Tools 9.15.6755, NumPy 2.5.4 and scikit-learn 1.9.1 on macOS arm64. This task-local environment differs from the original locked demonstration baseline; the new runs do not replace the historical full-suite or deployment evidence [19].</w:t>
+        <w:t>Additional isolated API acceptance on 23 October 2026 passed 33 checks; the explicit review-gate case study passed 27 checks. These counts overlap in covered behaviours and must not be added as distinct coverage. Neo4j was not verified in either fresh run. The worked example used Python 3.12.14, FastAPI 0.159.1, httpx 0.28.1, OR-Tools 9.15.6755, NumPy 2.5.4 and scikit-learn 1.9.1 on macOS arm64. This acceptance environment differs from the original locked demonstration baseline; the new runs do not replace the historical full-suite or deployment evidence [19].</w:t>
       </w:r>
     </w:p>
     <w:p>
@@ -11610,7 +12603,7 @@
         <w:pStyle w:val="Heading2"/>
       </w:pPr>
       <w:r>
-        <w:t>8.6 Remaining work</w:t>
+        <w:t>8.6 Future work</w:t>
       </w:r>
     </w:p>
     <w:p>
@@ -11618,7 +12611,7 @@
         <w:rPr>
           <w:sz w:val="22"/>
         </w:rPr>
-        <w:t>Three items dominate. First, independent dual review of the M6 answers: reviewer B and any required adjudication are still outstanding, so the report presents one reviewer's observations and does not claim dual-rater adequacy. Second, product-specific stability evidence would be needed before any engineering threshold could be described as a release limit. Third, authenticated multi-user operation, real order integration and production monitoring are product work beyond the module. The first is a submission dependency; the other two are research and engineering directions.</w:t>
+        <w:t>The next evaluation should test the revised M6 interface on a newly frozen question set, with judgements collected independently before comparison and disagreement resolution. The current A and B reviews describe the earlier frozen responses. Product-specific stability evidence is also required to replace engineering assumptions with defensible release limits. Authenticated multi-user operation, integration with real orders and production monitoring remain directions for deployment beyond the teaching prototype.</w:t>
       </w:r>
     </w:p>
     <w:p>
@@ -11634,7 +12627,7 @@
         <w:rPr>
           <w:sz w:val="22"/>
         </w:rPr>
-        <w:t>Role identifiers map to A: Xu Wenzhe, B: Zhu Jianyu, C: Wang Lepeng and D: Shen Ziyi, consistent with the proposal and final presentation handoff. Module ownership follows the proposal and is recorded here for traceability. It is not a mark allocation, and the confidential peer-review forms remain the official contribution record.</w:t>
+        <w:t>Role identifiers map to A: Xu Wenzhe, B: Zhu Jianyu, C: Wang Lepeng and D: Shen Ziyi, consistent with the submitted proposal. Module ownership follows the proposal and is recorded here for traceability. It is not a mark allocation, and the confidential peer-review forms remain the official contribution record.</w:t>
       </w:r>
     </w:p>
     <w:tbl>
@@ -12596,7 +13589,7 @@
         <w:rPr>
           <w:sz w:val="22"/>
         </w:rPr>
-        <w:t>The table records module ownership and planned cross-review responsibilities. Repository implementation and validation records support the technical work described here, but do not independently verify every named person's review activity. Each member should confirm actual contributions in the confidential course form; a planned role is not evidence that a particular review was completed.</w:t>
+        <w:t>The table summarises module ownership and the planned cross-review structure. Individual contribution assessment is documented separately through the course peer-review process. The module role codes A-D are distinct from the A/B labels used for the M6 review worksheets.</w:t>
       </w:r>
     </w:p>
     <w:p>
@@ -12628,7 +13621,7 @@
         <w:pStyle w:val="Heading2"/>
       </w:pPr>
       <w:r>
-        <w:t>8.9 Use of AI and responsibility for evidence</w:t>
+        <w:t>8.9 Conclusion</w:t>
       </w:r>
     </w:p>
     <w:p>
@@ -12636,7 +13629,7 @@
         <w:rPr>
           <w:sz w:val="22"/>
         </w:rPr>
-        <w:t>Generative AI assisted drafting, translation, code development, document layout and consistency checks. Codex assisted this report revision and prepared a separately labelled, non-blind technical review of frozen QA responses. That review is not human annotation, reviewer B, independent expert validation or clinical evidence. Existing human-review records retain their stated provenance and unresolved process limitations. The team remains responsible for checking the final text, confirming individual contributions and completing the remaining human evaluation.</w:t>
+        <w:t>PharmaColdOps integrates exposure assessment, recorded disposition, replacement delivery and evidence retrieval. Experiments support traceable rule execution, feasible constrained routing and persistent case-state management, while exposing weak monthly cause prediction and limited answer evidence. The resulting prototype provides a reproducible basis for further evaluation with independently reviewed questions and real operational tasks.</w:t>
       </w:r>
     </w:p>
     <w:p>
@@ -12903,7 +13896,7 @@
             <w:color w:val="000000"/>
             <w:sz w:val="20"/>
           </w:rPr>
-          <w:t>M6 independent evaluation</w:t>
+          <w:t>M6 evaluation protocol and frozen dataset</w:t>
         </w:r>
       </w:hyperlink>
       <w:r>
@@ -12918,7 +13911,7 @@
             <w:color w:val="000000"/>
             <w:sz w:val="20"/>
           </w:rPr>
-          <w:t>reviewer A intent labels</w:t>
+          <w:t>A intent labels</w:t>
         </w:r>
       </w:hyperlink>
       <w:r>
@@ -12933,14 +13926,14 @@
             <w:color w:val="000000"/>
             <w:sz w:val="20"/>
           </w:rPr>
-          <w:t>reviewer A answer ratings</w:t>
+          <w:t>A answer ratings</w:t>
         </w:r>
       </w:hyperlink>
       <w:r>
         <w:rPr>
           <w:sz w:val="20"/>
         </w:rPr>
-        <w:t>. Individual review inputs, not a complete two-rater report.</w:t>
+        <w:t>. Original protocol and completed A review inputs.</w:t>
       </w:r>
     </w:p>
     <w:p>
@@ -13216,37 +14209,15 @@
         <w:rPr>
           <w:sz w:val="20"/>
         </w:rPr>
-        <w:t xml:space="preserve">19. </w:t>
+        <w:t>19. Isolated API case-study records, 23 October 2026. Supplementary files: report-case-study.json, demo-acceptance-report.json and run_report_case_study.py. Automated review transactions; graph coverage outside the test scope.</w:t>
       </w:r>
-      <w:hyperlink r:id="rId41">
-        <w:r>
-          <w:rPr>
-            <w:color w:val="000000"/>
-            <w:sz w:val="20"/>
-          </w:rPr>
-          <w:t>Report worked-example evidence</w:t>
-        </w:r>
-      </w:hyperlink>
+    </w:p>
+    <w:p>
       <w:r>
         <w:rPr>
           <w:sz w:val="20"/>
         </w:rPr>
-        <w:t xml:space="preserve"> and </w:t>
-      </w:r>
-      <w:hyperlink r:id="rId42">
-        <w:r>
-          <w:rPr>
-            <w:color w:val="000000"/>
-            <w:sz w:val="20"/>
-          </w:rPr>
-          <w:t>isolated case runner</w:t>
-        </w:r>
-      </w:hyperlink>
-      <w:r>
-        <w:rPr>
-          <w:sz w:val="20"/>
-        </w:rPr>
-        <w:t>. New API workflow run on 23 October 2026, with explicit automated-review and graph-unverified boundaries.</w:t>
+        <w:t>20. B review worksheets, 23 October 2026. Supplementary files: intent-B.csv and ratings-B.csv. Completed review of the same 53 frozen questions.</w:t>
       </w:r>
     </w:p>
     <w:p>
@@ -13680,7 +14651,7 @@
                 <w:color w:val="000000"/>
                 <w:sz w:val="20"/>
               </w:rPr>
-              <w:t>Derived contract checks; single-reviewer M6 pilot, dual review still pending; no audio or vision claim</w:t>
+              <w:t>466 derived contract checks and descriptive A/B reviews of 53 frozen questions; independent reliability not established</w:t>
             </w:r>
           </w:p>
         </w:tc>
@@ -13829,7 +14800,7 @@
         </w:rPr>
         <w:t xml:space="preserve">The full </w:t>
       </w:r>
-      <w:hyperlink r:id="rId43">
+      <w:hyperlink r:id="rId41">
         <w:r>
           <w:rPr>
             <w:color w:val="000000"/>
@@ -13844,7 +14815,7 @@
         </w:rPr>
         <w:t xml:space="preserve"> and </w:t>
       </w:r>
-      <w:hyperlink r:id="rId44">
+      <w:hyperlink r:id="rId42">
         <w:r>
           <w:rPr>
             <w:color w:val="000000"/>

</xml_diff>

<commit_message>
Close M6 descriptive review and synchronize final deliverables
</commit_message>
<xml_diff>
--- a/docs/PharmaColdOps-Group-Report.docx
+++ b/docs/PharmaColdOps-Group-Report.docx
@@ -450,7 +450,7 @@
         <w:rPr>
           <w:sz w:val="21"/>
         </w:rPr>
-        <w:t>17</w:t>
+        <w:t>18</w:t>
       </w:r>
     </w:p>
     <w:p>
@@ -498,7 +498,7 @@
         <w:rPr>
           <w:sz w:val="21"/>
         </w:rPr>
-        <w:t>19</w:t>
+        <w:t>20</w:t>
       </w:r>
     </w:p>
     <w:p>
@@ -564,7 +564,7 @@
         <w:rPr>
           <w:sz w:val="21"/>
         </w:rPr>
-        <w:t>21</w:t>
+        <w:t>22</w:t>
       </w:r>
     </w:p>
     <w:p>
@@ -623,7 +623,7 @@
         <w:rPr>
           <w:sz w:val="22"/>
         </w:rPr>
-        <w:t>M6 review covers 53 frozen questions in completed A and B worksheets. Both identify weak evidence support and failures in scope handling. Because B was prepared with access to A, the results are reported as descriptive reviews rather than independent inter-rater validation.</w:t>
+        <w:t>M6 review covers 53 frozen questions in completed A and current B worksheets. Both identify weak evidence support and failures in scope handling. Historical process gaps and unresolved intent disagreements limit the results to descriptive comparison rather than independent inter-rater validation.</w:t>
       </w:r>
     </w:p>
     <w:p>
@@ -9944,7 +9944,7 @@
         <w:rPr>
           <w:sz w:val="22"/>
         </w:rPr>
-        <w:t>The A and B review sets each contain 53 intent labels and 53 answer/evidence ratings. Both use the same frozen questions and response hashes. The rating dimensions distinguish answer correctness, evidence relevance, evidence sufficiency, appropriate refusal and unsupported claims. B was prepared after access to A's judgements, so the two sets support descriptive comparison but not an independent inter-rater reliability estimate. No adjudicated intent gold standard or jointly validated answer-adequacy score is reported [7, 20].</w:t>
+        <w:t>The A and current B review sets each contain 53 intent labels and 53 answer/evidence ratings for the same frozen questions and response hashes. B reported no prior exposure to A, previous B worksheets, frozen responses or routing code before intent review. B's intent file was saved before the second-stage materials were prepared. B confirmed personal judgement and actual consultation of the listed sources. These are self-reported process statements. A's historical sealing times and source-consultation record remain unverified, so this closeout reports a descriptive comparison rather than independent reliability [7, 20].</w:t>
       </w:r>
     </w:p>
     <w:p>
@@ -9952,7 +9952,7 @@
         <w:rPr>
           <w:sz w:val="22"/>
         </w:rPr>
-        <w:t>The table retains all 53 questions in each review, including not-applicable (NA) ratings. Correctness, relevance and sufficiency use scores 0, 1 and 2; refusal appropriateness uses 0 or 1. Source consultation for B was limited to the frozen source catalogue and project records; external regulatory documents were not independently rechecked [7, 20].</w:t>
+        <w:t>Intent labels and acceptable-label sets match on 15/53 questions and differ on 38/53. B marked 37/53 questions ambiguous. Disagreements remain unadjudicated, so no adjudicated intent gold standard, independent accuracy, kappa or jointly validated answer-adequacy score is reported. The table retains all 53 questions per reviewer, including not-applicable (NA) ratings. Correctness, relevance and sufficiency use 0, 1 and 2; refusal appropriateness uses 0 or 1. B's source consultation includes external and project references as declared by the reviewer; the compiler did not independently re-audit those sources [7, 20].</w:t>
       </w:r>
     </w:p>
     <w:tbl>
@@ -14217,7 +14217,22 @@
         <w:rPr>
           <w:sz w:val="20"/>
         </w:rPr>
-        <w:t>20. B review worksheets, 23 October 2026. Supplementary files: intent-B.csv and ratings-B.csv. Completed review of the same 53 frozen questions.</w:t>
+        <w:t xml:space="preserve">20. </w:t>
+      </w:r>
+      <w:hyperlink r:id="rId41">
+        <w:r>
+          <w:rPr>
+            <w:color w:val="000000"/>
+            <w:sz w:val="20"/>
+          </w:rPr>
+          <w:t>M6 descriptive review closeout</w:t>
+        </w:r>
+      </w:hyperlink>
+      <w:r>
+        <w:rPr>
+          <w:sz w:val="20"/>
+        </w:rPr>
+        <w:t>, 23 October 2026. Current B worksheets and process record are retained in the private handoff package with A inputs, file hashes and 38 unresolved intent disagreements. Earlier B worksheets remain a separate historical version.</w:t>
       </w:r>
     </w:p>
     <w:p>
@@ -14800,7 +14815,7 @@
         </w:rPr>
         <w:t xml:space="preserve">The full </w:t>
       </w:r>
-      <w:hyperlink r:id="rId41">
+      <w:hyperlink r:id="rId42">
         <w:r>
           <w:rPr>
             <w:color w:val="000000"/>
@@ -14815,7 +14830,7 @@
         </w:rPr>
         <w:t xml:space="preserve"> and </w:t>
       </w:r>
-      <w:hyperlink r:id="rId42">
+      <w:hyperlink r:id="rId43">
         <w:r>
           <w:rPr>
             <w:color w:val="000000"/>

</xml_diff>